<commit_message>
Upto OSI model completed
</commit_message>
<xml_diff>
--- a/Note.docx
+++ b/Note.docx
@@ -320,6 +320,7 @@
       </w:pPr>
       <w:r>
         <w:rPr>
+          <w:noProof/>
           <w:sz w:val="24"/>
           <w:szCs w:val="24"/>
         </w:rPr>
@@ -546,6 +547,7 @@
       </w:pPr>
       <w:r>
         <w:rPr>
+          <w:noProof/>
           <w:sz w:val="24"/>
           <w:szCs w:val="24"/>
         </w:rPr>
@@ -983,6 +985,7 @@
       </w:pPr>
       <w:r>
         <w:rPr>
+          <w:noProof/>
           <w:sz w:val="24"/>
           <w:szCs w:val="24"/>
         </w:rPr>
@@ -1074,6 +1077,7 @@
       </w:pPr>
       <w:r>
         <w:rPr>
+          <w:noProof/>
           <w:sz w:val="24"/>
           <w:szCs w:val="24"/>
         </w:rPr>
@@ -1123,6 +1127,7 @@
       </w:pPr>
       <w:r>
         <w:rPr>
+          <w:noProof/>
           <w:sz w:val="24"/>
           <w:szCs w:val="24"/>
         </w:rPr>
@@ -1187,6 +1192,7 @@
       </w:pPr>
       <w:r>
         <w:rPr>
+          <w:noProof/>
           <w:sz w:val="24"/>
           <w:szCs w:val="24"/>
         </w:rPr>
@@ -1271,14 +1277,7 @@
           <w:sz w:val="24"/>
           <w:szCs w:val="24"/>
         </w:rPr>
-        <w:t>What is NIC</w:t>
-      </w:r>
-      <w:r>
-        <w:rPr>
-          <w:sz w:val="24"/>
-          <w:szCs w:val="24"/>
-        </w:rPr>
-        <w:t>?</w:t>
+        <w:t>What is NIC?</w:t>
       </w:r>
     </w:p>
     <w:p>
@@ -1564,6 +1563,21 @@
     </w:p>
     <w:p>
       <w:pPr>
+        <w:rPr>
+          <w:sz w:val="24"/>
+          <w:szCs w:val="24"/>
+        </w:rPr>
+      </w:pPr>
+      <w:r>
+        <w:rPr>
+          <w:sz w:val="24"/>
+          <w:szCs w:val="24"/>
+        </w:rPr>
+        <w:t>Institution of Electrical and Electronic Engineers</w:t>
+      </w:r>
+    </w:p>
+    <w:p>
+      <w:pPr>
         <w:pStyle w:val="ListParagraph"/>
         <w:numPr>
           <w:ilvl w:val="0"/>
@@ -1743,6 +1757,84 @@
           <w:szCs w:val="24"/>
         </w:rPr>
       </w:pPr>
+    </w:p>
+    <w:p>
+      <w:pPr>
+        <w:rPr>
+          <w:b/>
+          <w:sz w:val="24"/>
+          <w:szCs w:val="24"/>
+        </w:rPr>
+      </w:pPr>
+      <w:r>
+        <w:rPr>
+          <w:b/>
+          <w:sz w:val="24"/>
+          <w:szCs w:val="24"/>
+        </w:rPr>
+        <w:t>Sending Data from Source to Destination</w:t>
+      </w:r>
+    </w:p>
+    <w:p>
+      <w:pPr>
+        <w:rPr>
+          <w:sz w:val="24"/>
+          <w:szCs w:val="24"/>
+        </w:rPr>
+      </w:pPr>
+      <w:r>
+        <w:rPr>
+          <w:sz w:val="24"/>
+          <w:szCs w:val="24"/>
+        </w:rPr>
+        <w:t>Data is encoded and transmitted as signals in the transmission media.</w:t>
+      </w:r>
+    </w:p>
+    <w:p>
+      <w:pPr>
+        <w:rPr>
+          <w:sz w:val="24"/>
+          <w:szCs w:val="24"/>
+        </w:rPr>
+      </w:pPr>
+      <w:r>
+        <w:rPr>
+          <w:sz w:val="24"/>
+          <w:szCs w:val="24"/>
+        </w:rPr>
+        <w:t xml:space="preserve">Based on the bit pattern of data, the sending side generates a signal on the </w:t>
+      </w:r>
+      <w:r>
+        <w:rPr>
+          <w:sz w:val="24"/>
+          <w:szCs w:val="24"/>
+        </w:rPr>
+        <w:lastRenderedPageBreak/>
+        <w:t>selected transmission medium and then this signal propagates to the receiving end.</w:t>
+      </w:r>
+    </w:p>
+    <w:p>
+      <w:pPr>
+        <w:rPr>
+          <w:sz w:val="24"/>
+          <w:szCs w:val="24"/>
+        </w:rPr>
+      </w:pPr>
+      <w:r>
+        <w:rPr>
+          <w:sz w:val="24"/>
+          <w:szCs w:val="24"/>
+        </w:rPr>
+        <w:t>The receiving side extracts data from the signal and reproduce in its original format.</w:t>
+      </w:r>
+    </w:p>
+    <w:p>
+      <w:pPr>
+        <w:rPr>
+          <w:sz w:val="24"/>
+          <w:szCs w:val="24"/>
+        </w:rPr>
+      </w:pPr>
       <w:r>
         <w:rPr>
           <w:sz w:val="24"/>
@@ -1763,7 +1855,14 @@
           <w:sz w:val="24"/>
           <w:szCs w:val="24"/>
         </w:rPr>
-        <w:t>What is Bandwidth</w:t>
+        <w:t>How s</w:t>
+      </w:r>
+      <w:r>
+        <w:rPr>
+          <w:sz w:val="24"/>
+          <w:szCs w:val="24"/>
+        </w:rPr>
+        <w:t>ignals are generated</w:t>
       </w:r>
       <w:r>
         <w:rPr>
@@ -1785,6 +1884,74 @@
           <w:sz w:val="24"/>
           <w:szCs w:val="24"/>
         </w:rPr>
+        <w:t>A signal is generated by changing the strength (or any other property) of a particular form of energy with respect to time on a suitable medium.</w:t>
+      </w:r>
+    </w:p>
+    <w:p>
+      <w:pPr>
+        <w:rPr>
+          <w:sz w:val="24"/>
+          <w:szCs w:val="24"/>
+        </w:rPr>
+      </w:pPr>
+      <w:r>
+        <w:rPr>
+          <w:sz w:val="24"/>
+          <w:szCs w:val="24"/>
+        </w:rPr>
+        <w:t>Form of energy used can be Electrical, Light or Electromagnetic.</w:t>
+      </w:r>
+    </w:p>
+    <w:p>
+      <w:pPr>
+        <w:rPr>
+          <w:sz w:val="24"/>
+          <w:szCs w:val="24"/>
+        </w:rPr>
+      </w:pPr>
+    </w:p>
+    <w:p>
+      <w:pPr>
+        <w:rPr>
+          <w:sz w:val="24"/>
+          <w:szCs w:val="24"/>
+        </w:rPr>
+      </w:pPr>
+      <w:r>
+        <w:rPr>
+          <w:sz w:val="24"/>
+          <w:szCs w:val="24"/>
+        </w:rPr>
+        <w:t>Question:</w:t>
+      </w:r>
+    </w:p>
+    <w:p>
+      <w:pPr>
+        <w:rPr>
+          <w:sz w:val="24"/>
+          <w:szCs w:val="24"/>
+        </w:rPr>
+      </w:pPr>
+      <w:r>
+        <w:rPr>
+          <w:sz w:val="24"/>
+          <w:szCs w:val="24"/>
+        </w:rPr>
+        <w:t>What is Bandwidth?</w:t>
+      </w:r>
+    </w:p>
+    <w:p>
+      <w:pPr>
+        <w:rPr>
+          <w:sz w:val="24"/>
+          <w:szCs w:val="24"/>
+        </w:rPr>
+      </w:pPr>
+      <w:r>
+        <w:rPr>
+          <w:sz w:val="24"/>
+          <w:szCs w:val="24"/>
+        </w:rPr>
         <w:t>Bandwidth is the maximum capacity of a channel.</w:t>
       </w:r>
     </w:p>
@@ -1852,7 +2019,6 @@
           <w:sz w:val="24"/>
           <w:szCs w:val="24"/>
         </w:rPr>
-        <w:lastRenderedPageBreak/>
         <w:t>Throughput is the actual amount of data successfully transmitted per second.</w:t>
       </w:r>
     </w:p>
@@ -1883,28 +2049,7 @@
           <w:sz w:val="24"/>
           <w:szCs w:val="24"/>
         </w:rPr>
-        <w:t>Why</w:t>
-      </w:r>
-      <w:r>
-        <w:rPr>
-          <w:sz w:val="24"/>
-          <w:szCs w:val="24"/>
-        </w:rPr>
-        <w:t xml:space="preserve"> Throughput</w:t>
-      </w:r>
-      <w:r>
-        <w:rPr>
-          <w:sz w:val="24"/>
-          <w:szCs w:val="24"/>
-        </w:rPr>
-        <w:t xml:space="preserve"> &lt; Bandwidth</w:t>
-      </w:r>
-      <w:r>
-        <w:rPr>
-          <w:sz w:val="24"/>
-          <w:szCs w:val="24"/>
-        </w:rPr>
-        <w:t>?</w:t>
+        <w:t>Why Throughput &lt; Bandwidth?</w:t>
       </w:r>
     </w:p>
     <w:p>
@@ -2051,7 +2196,267 @@
           <w:sz w:val="24"/>
           <w:szCs w:val="24"/>
         </w:rPr>
-        <w:t>. Why</w:t>
+        <w:t>. Why?</w:t>
+      </w:r>
+    </w:p>
+    <w:p>
+      <w:pPr>
+        <w:pStyle w:val="ListParagraph"/>
+        <w:numPr>
+          <w:ilvl w:val="0"/>
+          <w:numId w:val="7"/>
+        </w:numPr>
+        <w:rPr>
+          <w:sz w:val="24"/>
+          <w:szCs w:val="24"/>
+        </w:rPr>
+      </w:pPr>
+      <w:r>
+        <w:rPr>
+          <w:sz w:val="24"/>
+          <w:szCs w:val="24"/>
+        </w:rPr>
+        <w:t>Interference (walls, signals)</w:t>
+      </w:r>
+    </w:p>
+    <w:p>
+      <w:pPr>
+        <w:pStyle w:val="ListParagraph"/>
+        <w:numPr>
+          <w:ilvl w:val="0"/>
+          <w:numId w:val="7"/>
+        </w:numPr>
+        <w:rPr>
+          <w:sz w:val="24"/>
+          <w:szCs w:val="24"/>
+        </w:rPr>
+      </w:pPr>
+      <w:r>
+        <w:rPr>
+          <w:sz w:val="24"/>
+          <w:szCs w:val="24"/>
+        </w:rPr>
+        <w:t>Shared medium</w:t>
+      </w:r>
+    </w:p>
+    <w:p>
+      <w:pPr>
+        <w:pStyle w:val="ListParagraph"/>
+        <w:numPr>
+          <w:ilvl w:val="0"/>
+          <w:numId w:val="7"/>
+        </w:numPr>
+        <w:rPr>
+          <w:sz w:val="24"/>
+          <w:szCs w:val="24"/>
+        </w:rPr>
+      </w:pPr>
+      <w:r>
+        <w:rPr>
+          <w:sz w:val="24"/>
+          <w:szCs w:val="24"/>
+        </w:rPr>
+        <w:t>Signal fading</w:t>
+      </w:r>
+    </w:p>
+    <w:p>
+      <w:pPr>
+        <w:pStyle w:val="ListParagraph"/>
+        <w:numPr>
+          <w:ilvl w:val="0"/>
+          <w:numId w:val="7"/>
+        </w:numPr>
+        <w:rPr>
+          <w:sz w:val="24"/>
+          <w:szCs w:val="24"/>
+        </w:rPr>
+      </w:pPr>
+      <w:r>
+        <w:rPr>
+          <w:sz w:val="24"/>
+          <w:szCs w:val="24"/>
+        </w:rPr>
+        <w:t>Noise</w:t>
+      </w:r>
+    </w:p>
+    <w:p>
+      <w:pPr>
+        <w:rPr>
+          <w:sz w:val="24"/>
+          <w:szCs w:val="24"/>
+        </w:rPr>
+      </w:pPr>
+      <w:r>
+        <w:rPr>
+          <w:sz w:val="24"/>
+          <w:szCs w:val="24"/>
+        </w:rPr>
+        <w:t>Question:</w:t>
+      </w:r>
+    </w:p>
+    <w:p>
+      <w:pPr>
+        <w:rPr>
+          <w:sz w:val="24"/>
+          <w:szCs w:val="24"/>
+        </w:rPr>
+      </w:pPr>
+      <w:r>
+        <w:rPr>
+          <w:sz w:val="24"/>
+          <w:szCs w:val="24"/>
+        </w:rPr>
+        <w:t>What is Data Transmission R</w:t>
+      </w:r>
+      <w:r>
+        <w:rPr>
+          <w:sz w:val="24"/>
+          <w:szCs w:val="24"/>
+        </w:rPr>
+        <w:t>ate (Bit Rate)?</w:t>
+      </w:r>
+    </w:p>
+    <w:p>
+      <w:pPr>
+        <w:rPr>
+          <w:sz w:val="24"/>
+          <w:szCs w:val="24"/>
+        </w:rPr>
+      </w:pPr>
+      <w:r>
+        <w:rPr>
+          <w:sz w:val="24"/>
+          <w:szCs w:val="24"/>
+        </w:rPr>
+        <w:t>Number of bits send per second</w:t>
+      </w:r>
+    </w:p>
+    <w:p>
+      <w:pPr>
+        <w:rPr>
+          <w:sz w:val="24"/>
+          <w:szCs w:val="24"/>
+        </w:rPr>
+      </w:pPr>
+      <w:r>
+        <w:rPr>
+          <w:sz w:val="24"/>
+          <w:szCs w:val="24"/>
+        </w:rPr>
+        <w:t xml:space="preserve">Unit: bps </w:t>
+      </w:r>
+    </w:p>
+    <w:p>
+      <w:pPr>
+        <w:rPr>
+          <w:sz w:val="24"/>
+          <w:szCs w:val="24"/>
+        </w:rPr>
+      </w:pPr>
+    </w:p>
+    <w:p>
+      <w:pPr>
+        <w:rPr>
+          <w:sz w:val="24"/>
+          <w:szCs w:val="24"/>
+        </w:rPr>
+      </w:pPr>
+      <w:r>
+        <w:rPr>
+          <w:sz w:val="24"/>
+          <w:szCs w:val="24"/>
+        </w:rPr>
+        <w:t>Question:</w:t>
+      </w:r>
+    </w:p>
+    <w:p>
+      <w:pPr>
+        <w:rPr>
+          <w:sz w:val="24"/>
+          <w:szCs w:val="24"/>
+        </w:rPr>
+      </w:pPr>
+      <w:r>
+        <w:rPr>
+          <w:sz w:val="24"/>
+          <w:szCs w:val="24"/>
+        </w:rPr>
+        <w:t xml:space="preserve">What is Baud Rate (Signaling Rate)? </w:t>
+      </w:r>
+    </w:p>
+    <w:p>
+      <w:pPr>
+        <w:rPr>
+          <w:sz w:val="24"/>
+          <w:szCs w:val="24"/>
+        </w:rPr>
+      </w:pPr>
+      <w:r>
+        <w:rPr>
+          <w:sz w:val="24"/>
+          <w:szCs w:val="24"/>
+        </w:rPr>
+        <w:t>The number of signal changes/symbols per second.</w:t>
+      </w:r>
+    </w:p>
+    <w:p>
+      <w:pPr>
+        <w:rPr>
+          <w:sz w:val="24"/>
+          <w:szCs w:val="24"/>
+        </w:rPr>
+      </w:pPr>
+      <w:r>
+        <w:rPr>
+          <w:sz w:val="24"/>
+          <w:szCs w:val="24"/>
+        </w:rPr>
+        <w:t>Unit: baud</w:t>
+      </w:r>
+    </w:p>
+    <w:p>
+      <w:pPr>
+        <w:rPr>
+          <w:sz w:val="24"/>
+          <w:szCs w:val="24"/>
+        </w:rPr>
+      </w:pPr>
+    </w:p>
+    <w:p>
+      <w:pPr>
+        <w:rPr>
+          <w:sz w:val="24"/>
+          <w:szCs w:val="24"/>
+        </w:rPr>
+      </w:pPr>
+      <w:r>
+        <w:rPr>
+          <w:sz w:val="24"/>
+          <w:szCs w:val="24"/>
+        </w:rPr>
+        <w:t>Question:</w:t>
+      </w:r>
+    </w:p>
+    <w:p>
+      <w:pPr>
+        <w:rPr>
+          <w:sz w:val="24"/>
+          <w:szCs w:val="24"/>
+        </w:rPr>
+      </w:pPr>
+      <w:r>
+        <w:rPr>
+          <w:sz w:val="24"/>
+          <w:szCs w:val="24"/>
+        </w:rPr>
+        <w:t xml:space="preserve">Why </w:t>
+      </w:r>
+      <w:r>
+        <w:rPr>
+          <w:sz w:val="24"/>
+          <w:szCs w:val="24"/>
+        </w:rPr>
+        <w:t>Bit rate ≠ Baud rate (always)</w:t>
       </w:r>
       <w:r>
         <w:rPr>
@@ -2068,8 +2473,161 @@
           <w:szCs w:val="24"/>
         </w:rPr>
       </w:pPr>
-      <w:bookmarkStart w:id="0" w:name="_GoBack"/>
-      <w:bookmarkEnd w:id="0"/>
+      <w:r>
+        <w:rPr>
+          <w:sz w:val="24"/>
+          <w:szCs w:val="24"/>
+        </w:rPr>
+        <w:t>Because one signal (symbol) can represent more than one bit</w:t>
+      </w:r>
+    </w:p>
+    <w:p>
+      <w:pPr>
+        <w:rPr>
+          <w:sz w:val="24"/>
+          <w:szCs w:val="24"/>
+        </w:rPr>
+      </w:pPr>
+    </w:p>
+    <w:p>
+      <w:pPr>
+        <w:rPr>
+          <w:sz w:val="24"/>
+          <w:szCs w:val="24"/>
+        </w:rPr>
+      </w:pPr>
+      <w:r>
+        <w:rPr>
+          <w:sz w:val="24"/>
+          <w:szCs w:val="24"/>
+        </w:rPr>
+        <w:t>Question:</w:t>
+      </w:r>
+    </w:p>
+    <w:p>
+      <w:pPr>
+        <w:rPr>
+          <w:sz w:val="24"/>
+          <w:szCs w:val="24"/>
+        </w:rPr>
+      </w:pPr>
+      <w:r>
+        <w:rPr>
+          <w:sz w:val="24"/>
+          <w:szCs w:val="24"/>
+        </w:rPr>
+        <w:t>Calculate Data Transmission Rate?</w:t>
+      </w:r>
+    </w:p>
+    <w:p>
+      <w:pPr>
+        <w:rPr>
+          <w:sz w:val="24"/>
+          <w:szCs w:val="24"/>
+        </w:rPr>
+      </w:pPr>
+      <w:r>
+        <w:rPr>
+          <w:sz w:val="24"/>
+          <w:szCs w:val="24"/>
+        </w:rPr>
+        <w:t>Given:</w:t>
+      </w:r>
+    </w:p>
+    <w:p>
+      <w:pPr>
+        <w:pStyle w:val="ListParagraph"/>
+        <w:numPr>
+          <w:ilvl w:val="0"/>
+          <w:numId w:val="5"/>
+        </w:numPr>
+        <w:rPr>
+          <w:sz w:val="24"/>
+          <w:szCs w:val="24"/>
+        </w:rPr>
+      </w:pPr>
+      <w:r>
+        <w:rPr>
+          <w:sz w:val="24"/>
+          <w:szCs w:val="24"/>
+        </w:rPr>
+        <w:lastRenderedPageBreak/>
+        <w:t>Baud rate = 2400 symbols/sec</w:t>
+      </w:r>
+    </w:p>
+    <w:p>
+      <w:pPr>
+        <w:pStyle w:val="ListParagraph"/>
+        <w:numPr>
+          <w:ilvl w:val="0"/>
+          <w:numId w:val="5"/>
+        </w:numPr>
+        <w:rPr>
+          <w:sz w:val="24"/>
+          <w:szCs w:val="24"/>
+        </w:rPr>
+      </w:pPr>
+      <w:r>
+        <w:rPr>
+          <w:sz w:val="24"/>
+          <w:szCs w:val="24"/>
+        </w:rPr>
+        <w:t>Each symbol = 2 bits</w:t>
+      </w:r>
+    </w:p>
+    <w:p>
+      <w:pPr>
+        <w:pStyle w:val="ListParagraph"/>
+        <w:rPr>
+          <w:sz w:val="24"/>
+          <w:szCs w:val="24"/>
+        </w:rPr>
+      </w:pPr>
+    </w:p>
+    <w:p>
+      <w:pPr>
+        <w:rPr>
+          <w:sz w:val="24"/>
+          <w:szCs w:val="24"/>
+        </w:rPr>
+      </w:pPr>
+      <w:r>
+        <w:rPr>
+          <w:sz w:val="24"/>
+          <w:szCs w:val="24"/>
+        </w:rPr>
+        <w:t>Bit rate = Baud rate × bits per symbol</w:t>
+      </w:r>
+    </w:p>
+    <w:p>
+      <w:pPr>
+        <w:rPr>
+          <w:sz w:val="24"/>
+          <w:szCs w:val="24"/>
+        </w:rPr>
+      </w:pPr>
+      <w:r>
+        <w:rPr>
+          <w:sz w:val="24"/>
+          <w:szCs w:val="24"/>
+        </w:rPr>
+        <w:t xml:space="preserve">         = 2400 × 2</w:t>
+      </w:r>
+    </w:p>
+    <w:p>
+      <w:pPr>
+        <w:rPr>
+          <w:sz w:val="24"/>
+          <w:szCs w:val="24"/>
+        </w:rPr>
+      </w:pPr>
+      <w:r>
+        <w:rPr>
+          <w:sz w:val="24"/>
+          <w:szCs w:val="24"/>
+        </w:rPr>
+        <w:t xml:space="preserve">         = 4800 bps</w:t>
+      </w:r>
     </w:p>
     <w:p>
       <w:pPr>
@@ -2113,6 +2671,233 @@
           <w:szCs w:val="24"/>
         </w:rPr>
       </w:pPr>
+    </w:p>
+    <w:p>
+      <w:pPr>
+        <w:rPr>
+          <w:b/>
+          <w:sz w:val="24"/>
+          <w:szCs w:val="24"/>
+        </w:rPr>
+      </w:pPr>
+      <w:r>
+        <w:rPr>
+          <w:b/>
+          <w:sz w:val="24"/>
+          <w:szCs w:val="24"/>
+        </w:rPr>
+        <w:t>Types of Computer Networks</w:t>
+      </w:r>
+    </w:p>
+    <w:p>
+      <w:pPr>
+        <w:rPr>
+          <w:sz w:val="24"/>
+          <w:szCs w:val="24"/>
+        </w:rPr>
+      </w:pPr>
+      <w:r>
+        <w:rPr>
+          <w:sz w:val="24"/>
+          <w:szCs w:val="24"/>
+        </w:rPr>
+        <w:t>Computer networks can be classified according to their size.</w:t>
+      </w:r>
+    </w:p>
+    <w:p>
+      <w:pPr>
+        <w:pStyle w:val="ListParagraph"/>
+        <w:numPr>
+          <w:ilvl w:val="0"/>
+          <w:numId w:val="6"/>
+        </w:numPr>
+        <w:rPr>
+          <w:sz w:val="24"/>
+          <w:szCs w:val="24"/>
+        </w:rPr>
+      </w:pPr>
+      <w:r>
+        <w:rPr>
+          <w:sz w:val="24"/>
+          <w:szCs w:val="24"/>
+        </w:rPr>
+        <w:t>Personal Area Network (PAN)</w:t>
+      </w:r>
+    </w:p>
+    <w:p>
+      <w:pPr>
+        <w:pStyle w:val="ListParagraph"/>
+        <w:numPr>
+          <w:ilvl w:val="0"/>
+          <w:numId w:val="6"/>
+        </w:numPr>
+        <w:rPr>
+          <w:sz w:val="24"/>
+          <w:szCs w:val="24"/>
+        </w:rPr>
+      </w:pPr>
+      <w:r>
+        <w:rPr>
+          <w:sz w:val="24"/>
+          <w:szCs w:val="24"/>
+        </w:rPr>
+        <w:t>Local area network (LAN)</w:t>
+      </w:r>
+    </w:p>
+    <w:p>
+      <w:pPr>
+        <w:pStyle w:val="ListParagraph"/>
+        <w:numPr>
+          <w:ilvl w:val="0"/>
+          <w:numId w:val="6"/>
+        </w:numPr>
+        <w:rPr>
+          <w:sz w:val="24"/>
+          <w:szCs w:val="24"/>
+        </w:rPr>
+      </w:pPr>
+      <w:r>
+        <w:rPr>
+          <w:sz w:val="24"/>
+          <w:szCs w:val="24"/>
+        </w:rPr>
+        <w:t>Metropolitan area network (MAN)</w:t>
+      </w:r>
+    </w:p>
+    <w:p>
+      <w:pPr>
+        <w:pStyle w:val="ListParagraph"/>
+        <w:numPr>
+          <w:ilvl w:val="0"/>
+          <w:numId w:val="6"/>
+        </w:numPr>
+        <w:rPr>
+          <w:sz w:val="24"/>
+          <w:szCs w:val="24"/>
+        </w:rPr>
+      </w:pPr>
+      <w:r>
+        <w:rPr>
+          <w:sz w:val="24"/>
+          <w:szCs w:val="24"/>
+        </w:rPr>
+        <w:t>Wide area network (WAN)</w:t>
+      </w:r>
+    </w:p>
+    <w:p>
+      <w:pPr>
+        <w:rPr>
+          <w:sz w:val="24"/>
+          <w:szCs w:val="24"/>
+        </w:rPr>
+      </w:pPr>
+    </w:p>
+    <w:p>
+      <w:pPr>
+        <w:rPr>
+          <w:b/>
+          <w:sz w:val="24"/>
+          <w:szCs w:val="24"/>
+        </w:rPr>
+      </w:pPr>
+      <w:r>
+        <w:rPr>
+          <w:b/>
+          <w:sz w:val="24"/>
+          <w:szCs w:val="24"/>
+        </w:rPr>
+        <w:t>Personal Area Network (PAN)</w:t>
+      </w:r>
+    </w:p>
+    <w:p>
+      <w:pPr>
+        <w:rPr>
+          <w:sz w:val="24"/>
+          <w:szCs w:val="24"/>
+        </w:rPr>
+      </w:pPr>
+      <w:r>
+        <w:rPr>
+          <w:sz w:val="24"/>
+          <w:szCs w:val="24"/>
+        </w:rPr>
+        <w:t>The smallest type of network.</w:t>
+      </w:r>
+    </w:p>
+    <w:p>
+      <w:pPr>
+        <w:rPr>
+          <w:sz w:val="24"/>
+          <w:szCs w:val="24"/>
+        </w:rPr>
+      </w:pPr>
+      <w:r>
+        <w:rPr>
+          <w:sz w:val="24"/>
+          <w:szCs w:val="24"/>
+        </w:rPr>
+        <w:t>Usually covers only a few meters.</w:t>
+      </w:r>
+    </w:p>
+    <w:p>
+      <w:pPr>
+        <w:rPr>
+          <w:sz w:val="24"/>
+          <w:szCs w:val="24"/>
+        </w:rPr>
+      </w:pPr>
+      <w:r>
+        <w:rPr>
+          <w:sz w:val="24"/>
+          <w:szCs w:val="24"/>
+        </w:rPr>
+        <w:t>Examples:</w:t>
+      </w:r>
+    </w:p>
+    <w:p>
+      <w:pPr>
+        <w:rPr>
+          <w:sz w:val="24"/>
+          <w:szCs w:val="24"/>
+        </w:rPr>
+      </w:pPr>
+      <w:r>
+        <w:rPr>
+          <w:sz w:val="24"/>
+          <w:szCs w:val="24"/>
+        </w:rPr>
+        <w:t xml:space="preserve">Connecting a mobile phone to </w:t>
+      </w:r>
+      <w:r>
+        <w:rPr>
+          <w:sz w:val="24"/>
+          <w:szCs w:val="24"/>
+        </w:rPr>
+        <w:t>wireless earbuds using Bluetooth.</w:t>
+      </w:r>
+    </w:p>
+    <w:p>
+      <w:pPr>
+        <w:rPr>
+          <w:sz w:val="24"/>
+          <w:szCs w:val="24"/>
+        </w:rPr>
+      </w:pPr>
+      <w:r>
+        <w:rPr>
+          <w:sz w:val="24"/>
+          <w:szCs w:val="24"/>
+        </w:rPr>
+        <w:t>Sharing internet from a phone to a laptop via a hotspot.</w:t>
+      </w:r>
+    </w:p>
+    <w:p>
+      <w:pPr>
+        <w:rPr>
+          <w:sz w:val="24"/>
+          <w:szCs w:val="24"/>
+        </w:rPr>
+      </w:pPr>
       <w:r>
         <w:rPr>
           <w:noProof/>
@@ -2120,10 +2905,10 @@
           <w:szCs w:val="24"/>
         </w:rPr>
         <w:drawing>
-          <wp:inline distT="0" distB="0" distL="0" distR="0" wp14:anchorId="27BD09D6" wp14:editId="7864F8C8">
-            <wp:extent cx="4258269" cy="2905530"/>
-            <wp:effectExtent l="0" t="0" r="9525" b="9525"/>
-            <wp:docPr id="12" name="Picture 12"/>
+          <wp:inline distT="0" distB="0" distL="0" distR="0" wp14:anchorId="1F7F0E3F" wp14:editId="44B549E3">
+            <wp:extent cx="2743200" cy="1939925"/>
+            <wp:effectExtent l="0" t="0" r="0" b="3175"/>
+            <wp:docPr id="20" name="Picture 20"/>
             <wp:cNvGraphicFramePr>
               <a:graphicFrameLocks xmlns:a="http://schemas.openxmlformats.org/drawingml/2006/main" noChangeAspect="1"/>
             </wp:cNvGraphicFramePr>
@@ -2143,7 +2928,7 @@
                   <pic:spPr>
                     <a:xfrm>
                       <a:off x="0" y="0"/>
-                      <a:ext cx="4258269" cy="2905530"/>
+                      <a:ext cx="2743200" cy="1939925"/>
                     </a:xfrm>
                     <a:prstGeom prst="rect">
                       <a:avLst/>
@@ -2163,150 +2948,6 @@
           <w:szCs w:val="24"/>
         </w:rPr>
       </w:pPr>
-    </w:p>
-    <w:p>
-      <w:pPr>
-        <w:rPr>
-          <w:sz w:val="24"/>
-          <w:szCs w:val="24"/>
-        </w:rPr>
-      </w:pPr>
-    </w:p>
-    <w:p>
-      <w:pPr>
-        <w:rPr>
-          <w:sz w:val="24"/>
-          <w:szCs w:val="24"/>
-        </w:rPr>
-      </w:pPr>
-    </w:p>
-    <w:p>
-      <w:pPr>
-        <w:rPr>
-          <w:sz w:val="24"/>
-          <w:szCs w:val="24"/>
-        </w:rPr>
-      </w:pPr>
-    </w:p>
-    <w:p>
-      <w:pPr>
-        <w:rPr>
-          <w:sz w:val="24"/>
-          <w:szCs w:val="24"/>
-        </w:rPr>
-      </w:pPr>
-    </w:p>
-    <w:p>
-      <w:pPr>
-        <w:rPr>
-          <w:sz w:val="24"/>
-          <w:szCs w:val="24"/>
-        </w:rPr>
-      </w:pPr>
-      <w:r>
-        <w:rPr>
-          <w:sz w:val="24"/>
-          <w:szCs w:val="24"/>
-        </w:rPr>
-        <w:t>Network Components</w:t>
-      </w:r>
-      <w:r>
-        <w:rPr>
-          <w:sz w:val="24"/>
-          <w:szCs w:val="24"/>
-        </w:rPr>
-        <w:t xml:space="preserve"> | Building blocks</w:t>
-      </w:r>
-    </w:p>
-    <w:p>
-      <w:pPr>
-        <w:rPr>
-          <w:sz w:val="24"/>
-          <w:szCs w:val="24"/>
-        </w:rPr>
-      </w:pPr>
-      <w:r>
-        <w:rPr>
-          <w:sz w:val="24"/>
-          <w:szCs w:val="24"/>
-        </w:rPr>
-        <w:t>A network can contain a range of different components, with each having a defined role in the network.</w:t>
-      </w:r>
-    </w:p>
-    <w:p>
-      <w:pPr>
-        <w:rPr>
-          <w:sz w:val="24"/>
-          <w:szCs w:val="24"/>
-        </w:rPr>
-      </w:pPr>
-    </w:p>
-    <w:p>
-      <w:pPr>
-        <w:rPr>
-          <w:sz w:val="24"/>
-          <w:szCs w:val="24"/>
-        </w:rPr>
-      </w:pPr>
-    </w:p>
-    <w:p>
-      <w:r>
-        <w:t>Ethernet is the most common type of wired network connection.</w:t>
-      </w:r>
-    </w:p>
-    <w:p>
-      <w:r>
-        <w:t>NIC – A piece of hardware that is built into a device. It allows it to have a wired or wireless connection.</w:t>
-      </w:r>
-    </w:p>
-    <w:p>
-      <w:pPr>
-        <w:rPr>
-          <w:sz w:val="24"/>
-          <w:szCs w:val="24"/>
-        </w:rPr>
-      </w:pPr>
-    </w:p>
-    <w:p>
-      <w:pPr>
-        <w:rPr>
-          <w:sz w:val="24"/>
-          <w:szCs w:val="24"/>
-        </w:rPr>
-      </w:pPr>
-    </w:p>
-    <w:p>
-      <w:pPr>
-        <w:rPr>
-          <w:sz w:val="24"/>
-          <w:szCs w:val="24"/>
-        </w:rPr>
-      </w:pPr>
-    </w:p>
-    <w:p/>
-    <w:p>
-      <w:pPr>
-        <w:rPr>
-          <w:b/>
-          <w:bCs/>
-        </w:rPr>
-      </w:pPr>
-      <w:r>
-        <w:rPr>
-          <w:b/>
-          <w:bCs/>
-        </w:rPr>
-        <w:t>Inside the organization</w:t>
-      </w:r>
-    </w:p>
-    <w:p/>
-    <w:p>
-      <w:pPr>
-        <w:rPr>
-          <w:sz w:val="24"/>
-          <w:szCs w:val="24"/>
-        </w:rPr>
-      </w:pPr>
       <w:r>
         <w:rPr>
           <w:noProof/>
@@ -2314,10 +2955,10 @@
           <w:szCs w:val="24"/>
         </w:rPr>
         <w:drawing>
-          <wp:inline distT="0" distB="0" distL="0" distR="0" wp14:anchorId="2A0EAA10" wp14:editId="3D719607">
-            <wp:extent cx="5943600" cy="3702050"/>
+          <wp:inline distT="0" distB="0" distL="0" distR="0" wp14:anchorId="4A2F8B4E" wp14:editId="1D000821">
+            <wp:extent cx="2743200" cy="1871663"/>
             <wp:effectExtent l="0" t="0" r="0" b="0"/>
-            <wp:docPr id="6" name="Picture 6"/>
+            <wp:docPr id="12" name="Picture 12"/>
             <wp:cNvGraphicFramePr>
               <a:graphicFrameLocks xmlns:a="http://schemas.openxmlformats.org/drawingml/2006/main" noChangeAspect="1"/>
             </wp:cNvGraphicFramePr>
@@ -2337,7 +2978,7 @@
                   <pic:spPr>
                     <a:xfrm>
                       <a:off x="0" y="0"/>
-                      <a:ext cx="5943600" cy="3702050"/>
+                      <a:ext cx="2743200" cy="1871663"/>
                     </a:xfrm>
                     <a:prstGeom prst="rect">
                       <a:avLst/>
@@ -2353,63 +2994,139 @@
     <w:p>
       <w:pPr>
         <w:rPr>
-          <w:sz w:val="24"/>
-          <w:szCs w:val="24"/>
-        </w:rPr>
-      </w:pPr>
-    </w:p>
-    <w:p>
-      <w:pPr>
-        <w:rPr>
-          <w:sz w:val="24"/>
-          <w:szCs w:val="24"/>
-        </w:rPr>
-      </w:pPr>
-      <w:r>
-        <w:rPr>
-          <w:sz w:val="24"/>
-          <w:szCs w:val="24"/>
-        </w:rPr>
-        <w:t>LAN – Type of network that is located within a single building or site</w:t>
-      </w:r>
-    </w:p>
-    <w:p>
-      <w:pPr>
-        <w:rPr>
-          <w:sz w:val="24"/>
-          <w:szCs w:val="24"/>
-        </w:rPr>
-      </w:pPr>
-      <w:r>
-        <w:rPr>
-          <w:sz w:val="24"/>
-          <w:szCs w:val="24"/>
-        </w:rPr>
-        <w:t>Data packet – The unit of data that contains the information to be transmitted across a network</w:t>
-      </w:r>
-    </w:p>
-    <w:p>
-      <w:pPr>
-        <w:rPr>
-          <w:sz w:val="24"/>
-          <w:szCs w:val="24"/>
-        </w:rPr>
-      </w:pPr>
-      <w:r>
-        <w:rPr>
-          <w:sz w:val="24"/>
-          <w:szCs w:val="24"/>
-        </w:rPr>
-        <w:t>Data collision – When two devices on a network send data simultaneously the data packets can collide</w:t>
-      </w:r>
-    </w:p>
-    <w:p>
-      <w:pPr>
-        <w:rPr>
-          <w:sz w:val="24"/>
-          <w:szCs w:val="24"/>
-        </w:rPr>
-      </w:pPr>
+          <w:b/>
+          <w:sz w:val="24"/>
+          <w:szCs w:val="24"/>
+        </w:rPr>
+      </w:pPr>
+      <w:r>
+        <w:rPr>
+          <w:b/>
+          <w:sz w:val="24"/>
+          <w:szCs w:val="24"/>
+        </w:rPr>
+        <w:t>Local area network (LAN)</w:t>
+      </w:r>
+    </w:p>
+    <w:p>
+      <w:pPr>
+        <w:rPr>
+          <w:sz w:val="24"/>
+          <w:szCs w:val="24"/>
+        </w:rPr>
+      </w:pPr>
+      <w:r>
+        <w:rPr>
+          <w:sz w:val="24"/>
+          <w:szCs w:val="24"/>
+        </w:rPr>
+        <w:t>Covers a small geographic area such as a home, office, or school.</w:t>
+      </w:r>
+    </w:p>
+    <w:p>
+      <w:pPr>
+        <w:rPr>
+          <w:sz w:val="24"/>
+          <w:szCs w:val="24"/>
+        </w:rPr>
+      </w:pPr>
+      <w:r>
+        <w:rPr>
+          <w:sz w:val="24"/>
+          <w:szCs w:val="24"/>
+        </w:rPr>
+        <w:t>It connects devices like computers, printers, and servers within a limited space.</w:t>
+      </w:r>
+    </w:p>
+    <w:p>
+      <w:pPr>
+        <w:rPr>
+          <w:sz w:val="24"/>
+          <w:szCs w:val="24"/>
+        </w:rPr>
+      </w:pPr>
+      <w:r>
+        <w:rPr>
+          <w:sz w:val="24"/>
+          <w:szCs w:val="24"/>
+        </w:rPr>
+        <w:t>LANs provide high data transmission speed.</w:t>
+      </w:r>
+    </w:p>
+    <w:p>
+      <w:pPr>
+        <w:rPr>
+          <w:sz w:val="24"/>
+          <w:szCs w:val="24"/>
+        </w:rPr>
+      </w:pPr>
+      <w:r>
+        <w:rPr>
+          <w:sz w:val="24"/>
+          <w:szCs w:val="24"/>
+        </w:rPr>
+        <w:t>Usually privately owned and managed.</w:t>
+      </w:r>
+    </w:p>
+    <w:p>
+      <w:pPr>
+        <w:rPr>
+          <w:sz w:val="24"/>
+          <w:szCs w:val="24"/>
+        </w:rPr>
+      </w:pPr>
+      <w:r>
+        <w:rPr>
+          <w:sz w:val="24"/>
+          <w:szCs w:val="24"/>
+        </w:rPr>
+        <w:t>Enable the sharing of resources such as files or hardware devices that may be needed by multiple users.</w:t>
+      </w:r>
+    </w:p>
+    <w:p>
+      <w:pPr>
+        <w:rPr>
+          <w:sz w:val="24"/>
+          <w:szCs w:val="24"/>
+        </w:rPr>
+      </w:pPr>
+      <w:r>
+        <w:rPr>
+          <w:sz w:val="24"/>
+          <w:szCs w:val="24"/>
+        </w:rPr>
+        <w:t>Examples:</w:t>
+      </w:r>
+    </w:p>
+    <w:p>
+      <w:pPr>
+        <w:rPr>
+          <w:sz w:val="24"/>
+          <w:szCs w:val="24"/>
+        </w:rPr>
+      </w:pPr>
+      <w:r>
+        <w:rPr>
+          <w:sz w:val="24"/>
+          <w:szCs w:val="24"/>
+        </w:rPr>
+        <w:t>A computer lab in a school.</w:t>
+      </w:r>
+    </w:p>
+    <w:p>
+      <w:pPr>
+        <w:rPr>
+          <w:sz w:val="24"/>
+          <w:szCs w:val="24"/>
+        </w:rPr>
+      </w:pPr>
+      <w:r>
+        <w:rPr>
+          <w:sz w:val="24"/>
+          <w:szCs w:val="24"/>
+        </w:rPr>
+        <w:t>Office network.</w:t>
+      </w:r>
     </w:p>
     <w:p>
       <w:pPr>
@@ -2424,11 +3141,12 @@
           <w:sz w:val="24"/>
           <w:szCs w:val="24"/>
         </w:rPr>
+        <w:lastRenderedPageBreak/>
         <w:drawing>
-          <wp:inline distT="0" distB="0" distL="0" distR="0" wp14:anchorId="7AEA6455" wp14:editId="7A128814">
-            <wp:extent cx="5191850" cy="3724795"/>
-            <wp:effectExtent l="0" t="0" r="8890" b="9525"/>
-            <wp:docPr id="7" name="Picture 7"/>
+          <wp:inline distT="0" distB="0" distL="0" distR="0" wp14:anchorId="349A7EF7" wp14:editId="57D8D9BA">
+            <wp:extent cx="2743200" cy="2398395"/>
+            <wp:effectExtent l="0" t="0" r="0" b="1905"/>
+            <wp:docPr id="21" name="Picture 21"/>
             <wp:cNvGraphicFramePr>
               <a:graphicFrameLocks xmlns:a="http://schemas.openxmlformats.org/drawingml/2006/main" noChangeAspect="1"/>
             </wp:cNvGraphicFramePr>
@@ -2448,7 +3166,7 @@
                   <pic:spPr>
                     <a:xfrm>
                       <a:off x="0" y="0"/>
-                      <a:ext cx="5191850" cy="3724795"/>
+                      <a:ext cx="2743200" cy="2398395"/>
                     </a:xfrm>
                     <a:prstGeom prst="rect">
                       <a:avLst/>
@@ -2473,7 +3191,6 @@
       <w:pPr>
         <w:rPr>
           <w:b/>
-          <w:bCs/>
           <w:sz w:val="24"/>
           <w:szCs w:val="24"/>
         </w:rPr>
@@ -2481,78 +3198,185 @@
       <w:r>
         <w:rPr>
           <w:b/>
-          <w:bCs/>
-          <w:sz w:val="24"/>
-          <w:szCs w:val="24"/>
-        </w:rPr>
-        <w:t>Outside the organization</w:t>
-      </w:r>
-    </w:p>
-    <w:p>
-      <w:pPr>
-        <w:rPr>
-          <w:sz w:val="24"/>
-          <w:szCs w:val="24"/>
-        </w:rPr>
-      </w:pPr>
-    </w:p>
-    <w:p>
-      <w:pPr>
-        <w:rPr>
-          <w:sz w:val="24"/>
-          <w:szCs w:val="24"/>
-        </w:rPr>
-      </w:pPr>
-      <w:r>
-        <w:rPr>
-          <w:sz w:val="24"/>
-          <w:szCs w:val="24"/>
-        </w:rPr>
-        <w:t xml:space="preserve">MAC (Media access control) Address </w:t>
-      </w:r>
-      <w:r>
-        <w:rPr>
-          <w:sz w:val="24"/>
-          <w:szCs w:val="24"/>
-        </w:rPr>
-        <w:t>–</w:t>
-      </w:r>
-      <w:r>
-        <w:rPr>
-          <w:sz w:val="24"/>
-          <w:szCs w:val="24"/>
-        </w:rPr>
-        <w:t xml:space="preserve"> </w:t>
-      </w:r>
-      <w:r>
-        <w:rPr>
-          <w:sz w:val="24"/>
-          <w:szCs w:val="24"/>
-        </w:rPr>
-        <w:t>A unique address that is given to the NIC in each device at the point of manufacture</w:t>
-      </w:r>
-    </w:p>
-    <w:p>
-      <w:pPr>
-        <w:rPr>
-          <w:sz w:val="24"/>
-          <w:szCs w:val="24"/>
-        </w:rPr>
-      </w:pPr>
-    </w:p>
-    <w:p>
-      <w:pPr>
-        <w:rPr>
-          <w:sz w:val="24"/>
-          <w:szCs w:val="24"/>
-        </w:rPr>
-      </w:pPr>
-      <w:r>
-        <w:rPr>
-          <w:sz w:val="24"/>
-          <w:szCs w:val="24"/>
-        </w:rPr>
-        <w:t>IP Address – A unique address that is given to a device when it connects to a network</w:t>
+          <w:sz w:val="24"/>
+          <w:szCs w:val="24"/>
+        </w:rPr>
+        <w:t>Metropolitan area network (MAN)</w:t>
+      </w:r>
+    </w:p>
+    <w:p>
+      <w:pPr>
+        <w:rPr>
+          <w:sz w:val="24"/>
+          <w:szCs w:val="24"/>
+        </w:rPr>
+      </w:pPr>
+      <w:r>
+        <w:rPr>
+          <w:sz w:val="24"/>
+          <w:szCs w:val="24"/>
+        </w:rPr>
+        <w:t>Covers a larger geographic area such as a city or a large campus.</w:t>
+      </w:r>
+    </w:p>
+    <w:p>
+      <w:pPr>
+        <w:rPr>
+          <w:sz w:val="24"/>
+          <w:szCs w:val="24"/>
+        </w:rPr>
+      </w:pPr>
+      <w:r>
+        <w:rPr>
+          <w:sz w:val="24"/>
+          <w:szCs w:val="24"/>
+        </w:rPr>
+        <w:t>Formed by connecting multiple LANs together.</w:t>
+      </w:r>
+    </w:p>
+    <w:p>
+      <w:pPr>
+        <w:rPr>
+          <w:sz w:val="24"/>
+          <w:szCs w:val="24"/>
+        </w:rPr>
+      </w:pPr>
+      <w:r>
+        <w:rPr>
+          <w:sz w:val="24"/>
+          <w:szCs w:val="24"/>
+        </w:rPr>
+        <w:t>Example:</w:t>
+      </w:r>
+    </w:p>
+    <w:p>
+      <w:pPr>
+        <w:rPr>
+          <w:sz w:val="24"/>
+          <w:szCs w:val="24"/>
+        </w:rPr>
+      </w:pPr>
+      <w:r>
+        <w:rPr>
+          <w:sz w:val="24"/>
+          <w:szCs w:val="24"/>
+        </w:rPr>
+        <w:t>City-wide internet service.</w:t>
+      </w:r>
+    </w:p>
+    <w:p>
+      <w:pPr>
+        <w:rPr>
+          <w:sz w:val="24"/>
+          <w:szCs w:val="24"/>
+        </w:rPr>
+      </w:pPr>
+      <w:r>
+        <w:rPr>
+          <w:sz w:val="24"/>
+          <w:szCs w:val="24"/>
+        </w:rPr>
+        <w:t>Cable television network in a city.</w:t>
+      </w:r>
+    </w:p>
+    <w:p>
+      <w:pPr>
+        <w:rPr>
+          <w:sz w:val="24"/>
+          <w:szCs w:val="24"/>
+        </w:rPr>
+      </w:pPr>
+    </w:p>
+    <w:p>
+      <w:pPr>
+        <w:rPr>
+          <w:b/>
+          <w:sz w:val="24"/>
+          <w:szCs w:val="24"/>
+        </w:rPr>
+      </w:pPr>
+      <w:r>
+        <w:rPr>
+          <w:b/>
+          <w:sz w:val="24"/>
+          <w:szCs w:val="24"/>
+        </w:rPr>
+        <w:t>Wide area network (WAN)</w:t>
+      </w:r>
+    </w:p>
+    <w:p>
+      <w:pPr>
+        <w:rPr>
+          <w:sz w:val="24"/>
+          <w:szCs w:val="24"/>
+        </w:rPr>
+      </w:pPr>
+      <w:r>
+        <w:rPr>
+          <w:sz w:val="24"/>
+          <w:szCs w:val="24"/>
+        </w:rPr>
+        <w:t>Covers a very large geographic area such as countries or continents.</w:t>
+      </w:r>
+    </w:p>
+    <w:p>
+      <w:pPr>
+        <w:rPr>
+          <w:sz w:val="24"/>
+          <w:szCs w:val="24"/>
+        </w:rPr>
+      </w:pPr>
+      <w:r>
+        <w:rPr>
+          <w:sz w:val="24"/>
+          <w:szCs w:val="24"/>
+        </w:rPr>
+        <w:t>Connects multiple LANs and MANs using long-distance communication links.</w:t>
+      </w:r>
+    </w:p>
+    <w:p>
+      <w:pPr>
+        <w:rPr>
+          <w:sz w:val="24"/>
+          <w:szCs w:val="24"/>
+        </w:rPr>
+      </w:pPr>
+      <w:r>
+        <w:rPr>
+          <w:sz w:val="24"/>
+          <w:szCs w:val="24"/>
+        </w:rPr>
+        <w:t>Have higher delays compared to smaller networks.</w:t>
+      </w:r>
+    </w:p>
+    <w:p>
+      <w:pPr>
+        <w:rPr>
+          <w:sz w:val="24"/>
+          <w:szCs w:val="24"/>
+        </w:rPr>
+      </w:pPr>
+      <w:r>
+        <w:rPr>
+          <w:sz w:val="24"/>
+          <w:szCs w:val="24"/>
+        </w:rPr>
+        <w:t>Example:</w:t>
+      </w:r>
+    </w:p>
+    <w:p>
+      <w:pPr>
+        <w:rPr>
+          <w:sz w:val="24"/>
+          <w:szCs w:val="24"/>
+        </w:rPr>
+      </w:pPr>
+      <w:r>
+        <w:rPr>
+          <w:sz w:val="24"/>
+          <w:szCs w:val="24"/>
+        </w:rPr>
+        <w:t>The internet</w:t>
       </w:r>
     </w:p>
     <w:p>
@@ -2576,12 +3400,11 @@
           <w:sz w:val="24"/>
           <w:szCs w:val="24"/>
         </w:rPr>
-        <w:lastRenderedPageBreak/>
         <w:drawing>
-          <wp:inline distT="0" distB="0" distL="0" distR="0" wp14:anchorId="367B583A" wp14:editId="4C874DFE">
-            <wp:extent cx="5943600" cy="2275840"/>
+          <wp:inline distT="0" distB="0" distL="0" distR="0" wp14:anchorId="4C3CA98F" wp14:editId="43E14B7B">
+            <wp:extent cx="2743200" cy="1677035"/>
             <wp:effectExtent l="0" t="0" r="0" b="0"/>
-            <wp:docPr id="8" name="Picture 8"/>
+            <wp:docPr id="10" name="Picture 10"/>
             <wp:cNvGraphicFramePr>
               <a:graphicFrameLocks xmlns:a="http://schemas.openxmlformats.org/drawingml/2006/main" noChangeAspect="1"/>
             </wp:cNvGraphicFramePr>
@@ -2601,7 +3424,7 @@
                   <pic:spPr>
                     <a:xfrm>
                       <a:off x="0" y="0"/>
-                      <a:ext cx="5943600" cy="2275840"/>
+                      <a:ext cx="2743200" cy="1677035"/>
                     </a:xfrm>
                     <a:prstGeom prst="rect">
                       <a:avLst/>
@@ -2625,126 +3448,81 @@
     <w:p>
       <w:pPr>
         <w:rPr>
-          <w:sz w:val="24"/>
-          <w:szCs w:val="24"/>
-        </w:rPr>
-      </w:pPr>
-      <w:r>
-        <w:rPr>
-          <w:sz w:val="24"/>
-          <w:szCs w:val="24"/>
-        </w:rPr>
-        <w:t>Allows us to communicate to a WAN (Wider area network)</w:t>
-      </w:r>
-    </w:p>
-    <w:p>
-      <w:pPr>
-        <w:rPr>
-          <w:sz w:val="24"/>
-          <w:szCs w:val="24"/>
-        </w:rPr>
-      </w:pPr>
-    </w:p>
-    <w:p>
-      <w:pPr>
-        <w:rPr>
-          <w:sz w:val="24"/>
-          <w:szCs w:val="24"/>
-        </w:rPr>
-      </w:pPr>
-      <w:r>
-        <w:rPr>
-          <w:sz w:val="24"/>
-          <w:szCs w:val="24"/>
-        </w:rPr>
-        <w:t xml:space="preserve">Is the dividing line between your network and the other </w:t>
-      </w:r>
-      <w:proofErr w:type="gramStart"/>
-      <w:r>
-        <w:rPr>
-          <w:sz w:val="24"/>
-          <w:szCs w:val="24"/>
-        </w:rPr>
-        <w:t>network</w:t>
-      </w:r>
-      <w:proofErr w:type="gramEnd"/>
-    </w:p>
-    <w:p>
-      <w:pPr>
-        <w:rPr>
-          <w:sz w:val="24"/>
-          <w:szCs w:val="24"/>
-        </w:rPr>
-      </w:pPr>
-    </w:p>
-    <w:p>
-      <w:pPr>
-        <w:rPr>
-          <w:sz w:val="24"/>
-          <w:szCs w:val="24"/>
-        </w:rPr>
-      </w:pPr>
-      <w:r>
-        <w:rPr>
-          <w:sz w:val="24"/>
-          <w:szCs w:val="24"/>
-        </w:rPr>
-        <w:t>Router – Network hardware that reads IP addresses to send data to the correct network or device</w:t>
-      </w:r>
-    </w:p>
-    <w:p>
-      <w:pPr>
-        <w:rPr>
-          <w:sz w:val="24"/>
-          <w:szCs w:val="24"/>
-        </w:rPr>
-      </w:pPr>
-      <w:r>
-        <w:rPr>
-          <w:sz w:val="24"/>
-          <w:szCs w:val="24"/>
-        </w:rPr>
-        <w:t>Routing table – A database that stores all the known routes across a network to different devices.</w:t>
-      </w:r>
-    </w:p>
-    <w:p>
-      <w:pPr>
-        <w:rPr>
-          <w:sz w:val="24"/>
-          <w:szCs w:val="24"/>
-        </w:rPr>
-      </w:pPr>
-    </w:p>
-    <w:p>
-      <w:pPr>
-        <w:rPr>
-          <w:sz w:val="24"/>
-          <w:szCs w:val="24"/>
-        </w:rPr>
-      </w:pPr>
-    </w:p>
-    <w:p>
-      <w:pPr>
-        <w:rPr>
-          <w:sz w:val="24"/>
-          <w:szCs w:val="24"/>
-        </w:rPr>
-      </w:pPr>
-      <w:r>
-        <w:rPr>
-          <w:sz w:val="24"/>
-          <w:szCs w:val="24"/>
-        </w:rPr>
-        <w:t>Wireless Communication</w:t>
-      </w:r>
-    </w:p>
-    <w:p>
-      <w:pPr>
-        <w:rPr>
-          <w:sz w:val="24"/>
-          <w:szCs w:val="24"/>
-        </w:rPr>
-      </w:pPr>
+          <w:b/>
+          <w:sz w:val="24"/>
+          <w:szCs w:val="24"/>
+        </w:rPr>
+      </w:pPr>
+      <w:r>
+        <w:rPr>
+          <w:b/>
+          <w:sz w:val="24"/>
+          <w:szCs w:val="24"/>
+        </w:rPr>
+        <w:t>The Internet</w:t>
+      </w:r>
+    </w:p>
+    <w:p>
+      <w:pPr>
+        <w:rPr>
+          <w:sz w:val="24"/>
+          <w:szCs w:val="24"/>
+        </w:rPr>
+      </w:pPr>
+      <w:r>
+        <w:rPr>
+          <w:sz w:val="24"/>
+          <w:szCs w:val="24"/>
+        </w:rPr>
+        <w:t>The internet is a worldwide collection of interconnected networks.</w:t>
+      </w:r>
+    </w:p>
+    <w:p>
+      <w:pPr>
+        <w:rPr>
+          <w:b/>
+          <w:sz w:val="24"/>
+          <w:szCs w:val="24"/>
+        </w:rPr>
+      </w:pPr>
+      <w:r>
+        <w:rPr>
+          <w:b/>
+          <w:sz w:val="24"/>
+          <w:szCs w:val="24"/>
+        </w:rPr>
+        <w:t>Intranets and Extranets</w:t>
+      </w:r>
+    </w:p>
+    <w:p>
+      <w:pPr>
+        <w:rPr>
+          <w:sz w:val="24"/>
+          <w:szCs w:val="24"/>
+        </w:rPr>
+      </w:pPr>
+      <w:r>
+        <w:rPr>
+          <w:sz w:val="24"/>
+          <w:szCs w:val="24"/>
+        </w:rPr>
+        <w:t>An intranet is a private network that is used within an organization. It is accessible only to authorized users such as employees.</w:t>
+      </w:r>
+    </w:p>
+    <w:p>
+      <w:pPr>
+        <w:rPr>
+          <w:sz w:val="24"/>
+          <w:szCs w:val="24"/>
+        </w:rPr>
+      </w:pPr>
+      <w:r>
+        <w:rPr>
+          <w:sz w:val="24"/>
+          <w:szCs w:val="24"/>
+        </w:rPr>
+        <w:t>An extranet is an extension of an intranet that allows limited access to external users such as customers, suppliers, or business partners. It provides controlled access to certain parts of the organization’s network.</w:t>
+      </w:r>
     </w:p>
     <w:p>
       <w:pPr>
@@ -2760,10 +3538,10 @@
           <w:szCs w:val="24"/>
         </w:rPr>
         <w:drawing>
-          <wp:inline distT="0" distB="0" distL="0" distR="0" wp14:anchorId="2512993E" wp14:editId="089B6FA8">
-            <wp:extent cx="5943600" cy="1925320"/>
+          <wp:inline distT="0" distB="0" distL="0" distR="0" wp14:anchorId="31D473A6" wp14:editId="3FECE484">
+            <wp:extent cx="2743200" cy="2578100"/>
             <wp:effectExtent l="0" t="0" r="0" b="0"/>
-            <wp:docPr id="9" name="Picture 9"/>
+            <wp:docPr id="19" name="Picture 19"/>
             <wp:cNvGraphicFramePr>
               <a:graphicFrameLocks xmlns:a="http://schemas.openxmlformats.org/drawingml/2006/main" noChangeAspect="1"/>
             </wp:cNvGraphicFramePr>
@@ -2783,7 +3561,7 @@
                   <pic:spPr>
                     <a:xfrm>
                       <a:off x="0" y="0"/>
-                      <a:ext cx="5943600" cy="1925320"/>
+                      <a:ext cx="2743200" cy="2578100"/>
                     </a:xfrm>
                     <a:prstGeom prst="rect">
                       <a:avLst/>
@@ -2799,68 +3577,1981 @@
     <w:p>
       <w:pPr>
         <w:rPr>
-          <w:sz w:val="24"/>
-          <w:szCs w:val="24"/>
-        </w:rPr>
-      </w:pPr>
-    </w:p>
-    <w:p>
-      <w:pPr>
-        <w:rPr>
-          <w:sz w:val="24"/>
-          <w:szCs w:val="24"/>
-        </w:rPr>
-      </w:pPr>
-      <w:r>
-        <w:rPr>
-          <w:sz w:val="24"/>
-          <w:szCs w:val="24"/>
-        </w:rPr>
-        <w:t xml:space="preserve">Modem – Network hardware that converts between analogue and digital </w:t>
-      </w:r>
-      <w:proofErr w:type="spellStart"/>
-      <w:r>
-        <w:rPr>
-          <w:sz w:val="24"/>
-          <w:szCs w:val="24"/>
-        </w:rPr>
-        <w:t>signals.</w:t>
-      </w:r>
-      <w:r>
-        <w:rPr>
-          <w:sz w:val="24"/>
-          <w:szCs w:val="24"/>
-        </w:rPr>
-        <w:t>A</w:t>
-      </w:r>
-      <w:proofErr w:type="spellEnd"/>
-    </w:p>
-    <w:p>
-      <w:pPr>
-        <w:rPr>
-          <w:sz w:val="24"/>
-          <w:szCs w:val="24"/>
-        </w:rPr>
-      </w:pPr>
-    </w:p>
-    <w:p>
-      <w:pPr>
-        <w:rPr>
-          <w:sz w:val="24"/>
-          <w:szCs w:val="24"/>
-        </w:rPr>
-      </w:pPr>
-      <w:r>
-        <w:rPr>
-          <w:noProof/>
-          <w:sz w:val="24"/>
-          <w:szCs w:val="24"/>
-        </w:rPr>
+          <w:b/>
+          <w:sz w:val="24"/>
+          <w:szCs w:val="24"/>
+        </w:rPr>
+      </w:pPr>
+      <w:r>
+        <w:rPr>
+          <w:b/>
+          <w:sz w:val="24"/>
+          <w:szCs w:val="24"/>
+        </w:rPr>
+        <w:t>Creating a LAN</w:t>
+      </w:r>
+    </w:p>
+    <w:p>
+      <w:pPr>
+        <w:rPr>
+          <w:sz w:val="24"/>
+          <w:szCs w:val="24"/>
+        </w:rPr>
+      </w:pPr>
+      <w:r>
+        <w:rPr>
+          <w:sz w:val="24"/>
+          <w:szCs w:val="24"/>
+        </w:rPr>
+        <w:t>LAN’s can either be made wired or wireless.</w:t>
+      </w:r>
+    </w:p>
+    <w:p>
+      <w:pPr>
+        <w:rPr>
+          <w:sz w:val="24"/>
+          <w:szCs w:val="24"/>
+        </w:rPr>
+      </w:pPr>
+      <w:r>
+        <w:rPr>
+          <w:sz w:val="24"/>
+          <w:szCs w:val="24"/>
+        </w:rPr>
+        <w:lastRenderedPageBreak/>
+        <w:t>Twisted pair, coax or fiber optic cable can be used in wired LAN’s.</w:t>
+      </w:r>
+    </w:p>
+    <w:p>
+      <w:pPr>
+        <w:rPr>
+          <w:sz w:val="24"/>
+          <w:szCs w:val="24"/>
+        </w:rPr>
+      </w:pPr>
+      <w:r>
+        <w:rPr>
+          <w:sz w:val="24"/>
+          <w:szCs w:val="24"/>
+        </w:rPr>
+        <w:t>Nodes are linked together with a certain topology.</w:t>
+      </w:r>
+    </w:p>
+    <w:p>
+      <w:pPr>
+        <w:rPr>
+          <w:sz w:val="24"/>
+          <w:szCs w:val="24"/>
+        </w:rPr>
+      </w:pPr>
+    </w:p>
+    <w:p>
+      <w:pPr>
+        <w:rPr>
+          <w:b/>
+          <w:sz w:val="24"/>
+          <w:szCs w:val="24"/>
+        </w:rPr>
+      </w:pPr>
+      <w:r>
+        <w:rPr>
+          <w:b/>
+          <w:sz w:val="24"/>
+          <w:szCs w:val="24"/>
+        </w:rPr>
+        <w:t>Network topologies.</w:t>
+      </w:r>
+    </w:p>
+    <w:p>
+      <w:pPr>
+        <w:rPr>
+          <w:sz w:val="24"/>
+          <w:szCs w:val="24"/>
+        </w:rPr>
+      </w:pPr>
+      <w:r>
+        <w:rPr>
+          <w:sz w:val="24"/>
+          <w:szCs w:val="24"/>
+        </w:rPr>
+        <w:t>The physical or logical arrangement of devices (hosts) and how they are connected to each other in a network.</w:t>
+      </w:r>
+    </w:p>
+    <w:p>
+      <w:pPr>
+        <w:rPr>
+          <w:sz w:val="24"/>
+          <w:szCs w:val="24"/>
+        </w:rPr>
+      </w:pPr>
+      <w:r>
+        <w:rPr>
+          <w:sz w:val="24"/>
+          <w:szCs w:val="24"/>
+        </w:rPr>
+        <w:t>Defines how data flows and how devices communicate.</w:t>
+      </w:r>
+    </w:p>
+    <w:p>
+      <w:pPr>
+        <w:rPr>
+          <w:sz w:val="24"/>
+          <w:szCs w:val="24"/>
+        </w:rPr>
+      </w:pPr>
+      <w:r>
+        <w:rPr>
+          <w:sz w:val="24"/>
+          <w:szCs w:val="24"/>
+        </w:rPr>
+        <w:t>There are two main types of topologies.</w:t>
+      </w:r>
+    </w:p>
+    <w:p>
+      <w:pPr>
+        <w:rPr>
+          <w:sz w:val="24"/>
+          <w:szCs w:val="24"/>
+        </w:rPr>
+      </w:pPr>
+      <w:r>
+        <w:rPr>
+          <w:sz w:val="24"/>
+          <w:szCs w:val="24"/>
+        </w:rPr>
+        <w:t>Physical Topology and Logical Topology</w:t>
+      </w:r>
+    </w:p>
+    <w:p>
+      <w:pPr>
+        <w:rPr>
+          <w:b/>
+          <w:sz w:val="24"/>
+          <w:szCs w:val="24"/>
+        </w:rPr>
+      </w:pPr>
+      <w:r>
+        <w:rPr>
+          <w:b/>
+          <w:sz w:val="24"/>
+          <w:szCs w:val="24"/>
+        </w:rPr>
+        <w:t xml:space="preserve">Physical Topology: </w:t>
+      </w:r>
+    </w:p>
+    <w:p>
+      <w:pPr>
+        <w:rPr>
+          <w:sz w:val="24"/>
+          <w:szCs w:val="24"/>
+        </w:rPr>
+      </w:pPr>
+      <w:r>
+        <w:rPr>
+          <w:sz w:val="24"/>
+          <w:szCs w:val="24"/>
+        </w:rPr>
+        <w:t>The actual physical layout of cables and devices.</w:t>
+      </w:r>
+    </w:p>
+    <w:p>
+      <w:pPr>
+        <w:rPr>
+          <w:sz w:val="24"/>
+          <w:szCs w:val="24"/>
+        </w:rPr>
+      </w:pPr>
+      <w:r>
+        <w:rPr>
+          <w:sz w:val="24"/>
+          <w:szCs w:val="24"/>
+        </w:rPr>
+        <w:t>Shows how devices are physically connected.</w:t>
+      </w:r>
+    </w:p>
+    <w:p>
+      <w:pPr>
+        <w:rPr>
+          <w:sz w:val="24"/>
+          <w:szCs w:val="24"/>
+        </w:rPr>
+      </w:pPr>
+    </w:p>
+    <w:p>
+      <w:pPr>
+        <w:rPr>
+          <w:sz w:val="24"/>
+          <w:szCs w:val="24"/>
+        </w:rPr>
+      </w:pPr>
+      <w:r>
+        <w:rPr>
+          <w:sz w:val="24"/>
+          <w:szCs w:val="24"/>
+        </w:rPr>
+        <w:t>Examples:</w:t>
+      </w:r>
+    </w:p>
+    <w:p>
+      <w:pPr>
+        <w:rPr>
+          <w:sz w:val="24"/>
+          <w:szCs w:val="24"/>
+        </w:rPr>
+      </w:pPr>
+      <w:r>
+        <w:rPr>
+          <w:sz w:val="24"/>
+          <w:szCs w:val="24"/>
+        </w:rPr>
+        <w:t>Bus, Star, Mesh, Ring, Tree, Hybrid</w:t>
+      </w:r>
+    </w:p>
+    <w:p>
+      <w:pPr>
+        <w:rPr>
+          <w:sz w:val="24"/>
+          <w:szCs w:val="24"/>
+        </w:rPr>
+      </w:pPr>
+    </w:p>
+    <w:p>
+      <w:pPr>
+        <w:rPr>
+          <w:b/>
+          <w:sz w:val="24"/>
+          <w:szCs w:val="24"/>
+        </w:rPr>
+      </w:pPr>
+      <w:r>
+        <w:rPr>
+          <w:b/>
+          <w:sz w:val="24"/>
+          <w:szCs w:val="24"/>
+        </w:rPr>
+        <w:t>Star Topology</w:t>
+      </w:r>
+    </w:p>
+    <w:p>
+      <w:pPr>
+        <w:rPr>
+          <w:sz w:val="24"/>
+          <w:szCs w:val="24"/>
+        </w:rPr>
+      </w:pPr>
+      <w:r>
+        <w:rPr>
+          <w:sz w:val="24"/>
+          <w:szCs w:val="24"/>
+        </w:rPr>
+        <w:t xml:space="preserve">All devices are connected to a central device such as a switch or hub. </w:t>
+      </w:r>
+    </w:p>
+    <w:p>
+      <w:pPr>
+        <w:rPr>
+          <w:sz w:val="24"/>
+          <w:szCs w:val="24"/>
+        </w:rPr>
+      </w:pPr>
+      <w:r>
+        <w:rPr>
+          <w:sz w:val="24"/>
+          <w:szCs w:val="24"/>
+        </w:rPr>
+        <w:t>All communication passes through this central point.</w:t>
+      </w:r>
+    </w:p>
+    <w:p>
+      <w:pPr>
+        <w:rPr>
+          <w:sz w:val="24"/>
+          <w:szCs w:val="24"/>
+        </w:rPr>
+      </w:pPr>
+      <w:r>
+        <w:rPr>
+          <w:sz w:val="24"/>
+          <w:szCs w:val="24"/>
+        </w:rPr>
+        <w:t>Easy to manage and troubleshoot.</w:t>
+      </w:r>
+    </w:p>
+    <w:p>
+      <w:pPr>
+        <w:rPr>
+          <w:sz w:val="24"/>
+          <w:szCs w:val="24"/>
+        </w:rPr>
+      </w:pPr>
+      <w:r>
+        <w:rPr>
+          <w:sz w:val="24"/>
+          <w:szCs w:val="24"/>
+        </w:rPr>
+        <w:t>Failure of one device does not affect others.</w:t>
+      </w:r>
+    </w:p>
+    <w:p>
+      <w:pPr>
+        <w:rPr>
+          <w:sz w:val="24"/>
+          <w:szCs w:val="24"/>
+        </w:rPr>
+      </w:pPr>
+      <w:r>
+        <w:rPr>
+          <w:sz w:val="24"/>
+          <w:szCs w:val="24"/>
+        </w:rPr>
+        <w:t>If the central device fails, the whole network stops.</w:t>
+      </w:r>
+    </w:p>
+    <w:p>
+      <w:pPr>
+        <w:rPr>
+          <w:sz w:val="24"/>
+          <w:szCs w:val="24"/>
+        </w:rPr>
+      </w:pPr>
+    </w:p>
+    <w:p>
+      <w:pPr>
+        <w:rPr>
+          <w:b/>
+          <w:sz w:val="24"/>
+          <w:szCs w:val="24"/>
+        </w:rPr>
+      </w:pPr>
+      <w:r>
+        <w:rPr>
+          <w:b/>
+          <w:sz w:val="24"/>
+          <w:szCs w:val="24"/>
+        </w:rPr>
+        <w:t>Bus Topology</w:t>
+      </w:r>
+    </w:p>
+    <w:p>
+      <w:pPr>
+        <w:rPr>
+          <w:sz w:val="24"/>
+          <w:szCs w:val="24"/>
+        </w:rPr>
+      </w:pPr>
+      <w:r>
+        <w:rPr>
+          <w:sz w:val="24"/>
+          <w:szCs w:val="24"/>
+        </w:rPr>
+        <w:t xml:space="preserve">All devices are connected to a single </w:t>
+      </w:r>
+      <w:r>
+        <w:rPr>
+          <w:sz w:val="24"/>
+          <w:szCs w:val="24"/>
+        </w:rPr>
+        <w:t>central cable called the backbone.</w:t>
+      </w:r>
+    </w:p>
+    <w:p>
+      <w:pPr>
+        <w:rPr>
+          <w:sz w:val="24"/>
+          <w:szCs w:val="24"/>
+        </w:rPr>
+      </w:pPr>
+      <w:r>
+        <w:rPr>
+          <w:sz w:val="24"/>
+          <w:szCs w:val="24"/>
+        </w:rPr>
+        <w:t>Data sent by one device travels along the cable and is received by all devices, but only the intended device processes it.</w:t>
+      </w:r>
+    </w:p>
+    <w:p>
+      <w:pPr>
+        <w:rPr>
+          <w:sz w:val="24"/>
+          <w:szCs w:val="24"/>
+        </w:rPr>
+      </w:pPr>
+      <w:r>
+        <w:rPr>
+          <w:sz w:val="24"/>
+          <w:szCs w:val="24"/>
+        </w:rPr>
+        <w:t>Simple and low-cost.</w:t>
+      </w:r>
+    </w:p>
+    <w:p>
+      <w:pPr>
+        <w:rPr>
+          <w:sz w:val="24"/>
+          <w:szCs w:val="24"/>
+        </w:rPr>
+      </w:pPr>
+      <w:r>
+        <w:rPr>
+          <w:sz w:val="24"/>
+          <w:szCs w:val="24"/>
+        </w:rPr>
+        <w:t>If the main cable fails, the entire network goes down.</w:t>
+      </w:r>
+    </w:p>
+    <w:p>
+      <w:pPr>
+        <w:rPr>
+          <w:sz w:val="24"/>
+          <w:szCs w:val="24"/>
+        </w:rPr>
+      </w:pPr>
+    </w:p>
+    <w:p>
+      <w:pPr>
+        <w:rPr>
+          <w:b/>
+          <w:sz w:val="24"/>
+          <w:szCs w:val="24"/>
+        </w:rPr>
+      </w:pPr>
+      <w:r>
+        <w:rPr>
+          <w:b/>
+          <w:sz w:val="24"/>
+          <w:szCs w:val="24"/>
+        </w:rPr>
+        <w:t>Ring Topology</w:t>
+      </w:r>
+    </w:p>
+    <w:p>
+      <w:pPr>
+        <w:rPr>
+          <w:sz w:val="24"/>
+          <w:szCs w:val="24"/>
+        </w:rPr>
+      </w:pPr>
+      <w:r>
+        <w:rPr>
+          <w:sz w:val="24"/>
+          <w:szCs w:val="24"/>
+        </w:rPr>
+        <w:t>Devices are connected in a circular manner where each device is connected to two others.</w:t>
+      </w:r>
+    </w:p>
+    <w:p>
+      <w:pPr>
+        <w:rPr>
+          <w:sz w:val="24"/>
+          <w:szCs w:val="24"/>
+        </w:rPr>
+      </w:pPr>
+      <w:r>
+        <w:rPr>
+          <w:sz w:val="24"/>
+          <w:szCs w:val="24"/>
+        </w:rPr>
+        <w:t>Data travels in one direction around the ring until it reaches the destination.</w:t>
+      </w:r>
+    </w:p>
+    <w:p>
+      <w:pPr>
+        <w:rPr>
+          <w:sz w:val="24"/>
+          <w:szCs w:val="24"/>
+        </w:rPr>
+      </w:pPr>
+      <w:r>
+        <w:rPr>
+          <w:sz w:val="24"/>
+          <w:szCs w:val="24"/>
+        </w:rPr>
+        <w:t>Provides orderly data transmission.</w:t>
+      </w:r>
+    </w:p>
+    <w:p>
+      <w:pPr>
+        <w:rPr>
+          <w:sz w:val="24"/>
+          <w:szCs w:val="24"/>
+        </w:rPr>
+      </w:pPr>
+      <w:r>
+        <w:rPr>
+          <w:sz w:val="24"/>
+          <w:szCs w:val="24"/>
+        </w:rPr>
+        <w:t>Failure in one device or connection can disrupt the entire network.</w:t>
+      </w:r>
+    </w:p>
+    <w:p>
+      <w:pPr>
+        <w:rPr>
+          <w:sz w:val="24"/>
+          <w:szCs w:val="24"/>
+        </w:rPr>
+      </w:pPr>
+    </w:p>
+    <w:p>
+      <w:pPr>
+        <w:rPr>
+          <w:b/>
+          <w:sz w:val="24"/>
+          <w:szCs w:val="24"/>
+        </w:rPr>
+      </w:pPr>
+      <w:r>
+        <w:rPr>
+          <w:b/>
+          <w:sz w:val="24"/>
+          <w:szCs w:val="24"/>
+        </w:rPr>
+        <w:t>Mesh Topology</w:t>
+      </w:r>
+    </w:p>
+    <w:p>
+      <w:pPr>
+        <w:rPr>
+          <w:sz w:val="24"/>
+          <w:szCs w:val="24"/>
+        </w:rPr>
+      </w:pPr>
+      <w:r>
+        <w:rPr>
+          <w:sz w:val="24"/>
+          <w:szCs w:val="24"/>
+        </w:rPr>
+        <w:t>Each device is connected to multiple other devices.</w:t>
+      </w:r>
+    </w:p>
+    <w:p>
+      <w:pPr>
+        <w:rPr>
+          <w:sz w:val="24"/>
+          <w:szCs w:val="24"/>
+        </w:rPr>
+      </w:pPr>
+      <w:r>
+        <w:rPr>
+          <w:sz w:val="24"/>
+          <w:szCs w:val="24"/>
+        </w:rPr>
+        <w:t>In a full mesh, each device is connected to every other device.</w:t>
+      </w:r>
+    </w:p>
+    <w:p>
+      <w:pPr>
+        <w:rPr>
+          <w:sz w:val="24"/>
+          <w:szCs w:val="24"/>
+        </w:rPr>
+      </w:pPr>
+      <w:r>
+        <w:rPr>
+          <w:sz w:val="24"/>
+          <w:szCs w:val="24"/>
+        </w:rPr>
+        <w:t>Provides high reliability and multiple paths for data.</w:t>
+      </w:r>
+    </w:p>
+    <w:p>
+      <w:pPr>
+        <w:rPr>
+          <w:sz w:val="24"/>
+          <w:szCs w:val="24"/>
+        </w:rPr>
+      </w:pPr>
+      <w:r>
+        <w:rPr>
+          <w:sz w:val="24"/>
+          <w:szCs w:val="24"/>
+        </w:rPr>
+        <w:lastRenderedPageBreak/>
+        <w:t>Expensive and complex to set up due to the large number of connections.</w:t>
+      </w:r>
+    </w:p>
+    <w:p>
+      <w:pPr>
+        <w:rPr>
+          <w:sz w:val="24"/>
+          <w:szCs w:val="24"/>
+        </w:rPr>
+      </w:pPr>
+    </w:p>
+    <w:p>
+      <w:pPr>
+        <w:rPr>
+          <w:b/>
+          <w:sz w:val="24"/>
+          <w:szCs w:val="24"/>
+        </w:rPr>
+      </w:pPr>
+      <w:r>
+        <w:rPr>
+          <w:b/>
+          <w:sz w:val="24"/>
+          <w:szCs w:val="24"/>
+        </w:rPr>
+        <w:t>Tree Topology</w:t>
+      </w:r>
+    </w:p>
+    <w:p>
+      <w:pPr>
+        <w:rPr>
+          <w:sz w:val="24"/>
+          <w:szCs w:val="24"/>
+        </w:rPr>
+      </w:pPr>
+      <w:r>
+        <w:rPr>
+          <w:sz w:val="24"/>
+          <w:szCs w:val="24"/>
+        </w:rPr>
+        <w:t>A hierarchical structure that combines characteristics of star and bus topologies.</w:t>
+      </w:r>
+    </w:p>
+    <w:p>
+      <w:pPr>
+        <w:rPr>
+          <w:sz w:val="24"/>
+          <w:szCs w:val="24"/>
+        </w:rPr>
+      </w:pPr>
+      <w:r>
+        <w:rPr>
+          <w:sz w:val="24"/>
+          <w:szCs w:val="24"/>
+        </w:rPr>
+        <w:t>Has a root node and branches out to multiple levels of devices.</w:t>
+      </w:r>
+    </w:p>
+    <w:p>
+      <w:pPr>
+        <w:rPr>
+          <w:sz w:val="24"/>
+          <w:szCs w:val="24"/>
+        </w:rPr>
+      </w:pPr>
+      <w:r>
+        <w:rPr>
+          <w:sz w:val="24"/>
+          <w:szCs w:val="24"/>
+        </w:rPr>
+        <w:t>Scalable and suitable for large networks.</w:t>
+      </w:r>
+    </w:p>
+    <w:p>
+      <w:pPr>
+        <w:rPr>
+          <w:sz w:val="24"/>
+          <w:szCs w:val="24"/>
+        </w:rPr>
+      </w:pPr>
+      <w:r>
+        <w:rPr>
+          <w:sz w:val="24"/>
+          <w:szCs w:val="24"/>
+        </w:rPr>
+        <w:t>Failure of higher-level devices can affect many lower-level nodes.</w:t>
+      </w:r>
+    </w:p>
+    <w:p>
+      <w:pPr>
+        <w:rPr>
+          <w:sz w:val="24"/>
+          <w:szCs w:val="24"/>
+        </w:rPr>
+      </w:pPr>
+    </w:p>
+    <w:p>
+      <w:pPr>
+        <w:rPr>
+          <w:b/>
+          <w:sz w:val="24"/>
+          <w:szCs w:val="24"/>
+        </w:rPr>
+      </w:pPr>
+      <w:r>
+        <w:rPr>
+          <w:b/>
+          <w:sz w:val="24"/>
+          <w:szCs w:val="24"/>
+        </w:rPr>
+        <w:t>Hybrid Topology</w:t>
+      </w:r>
+    </w:p>
+    <w:p>
+      <w:pPr>
+        <w:rPr>
+          <w:sz w:val="24"/>
+          <w:szCs w:val="24"/>
+        </w:rPr>
+      </w:pPr>
+      <w:r>
+        <w:rPr>
+          <w:sz w:val="24"/>
+          <w:szCs w:val="24"/>
+        </w:rPr>
+        <w:t>A combination of two or more different topologies.</w:t>
+      </w:r>
+    </w:p>
+    <w:p>
+      <w:pPr>
+        <w:rPr>
+          <w:sz w:val="24"/>
+          <w:szCs w:val="24"/>
+        </w:rPr>
+      </w:pPr>
+      <w:r>
+        <w:rPr>
+          <w:sz w:val="24"/>
+          <w:szCs w:val="24"/>
+        </w:rPr>
+        <w:t>Example: star-bus, star-ring</w:t>
+      </w:r>
+    </w:p>
+    <w:p>
+      <w:pPr>
+        <w:rPr>
+          <w:sz w:val="24"/>
+          <w:szCs w:val="24"/>
+        </w:rPr>
+      </w:pPr>
+      <w:r>
+        <w:rPr>
+          <w:sz w:val="24"/>
+          <w:szCs w:val="24"/>
+        </w:rPr>
+        <w:t>Flexible and can be designed to meet specific network needs.</w:t>
+      </w:r>
+    </w:p>
+    <w:p>
+      <w:pPr>
+        <w:rPr>
+          <w:sz w:val="24"/>
+          <w:szCs w:val="24"/>
+        </w:rPr>
+      </w:pPr>
+      <w:r>
+        <w:rPr>
+          <w:sz w:val="24"/>
+          <w:szCs w:val="24"/>
+        </w:rPr>
+        <w:t>Can be complex and costly to implement and manage.</w:t>
+      </w:r>
+    </w:p>
+    <w:p>
+      <w:pPr>
+        <w:rPr>
+          <w:b/>
+          <w:sz w:val="24"/>
+          <w:szCs w:val="24"/>
+        </w:rPr>
+      </w:pPr>
+      <w:r>
+        <w:rPr>
+          <w:b/>
+          <w:sz w:val="24"/>
+          <w:szCs w:val="24"/>
+        </w:rPr>
+        <w:t xml:space="preserve"> </w:t>
+      </w:r>
+    </w:p>
+    <w:p>
+      <w:pPr>
+        <w:rPr>
+          <w:b/>
+          <w:sz w:val="24"/>
+          <w:szCs w:val="24"/>
+        </w:rPr>
+      </w:pPr>
+      <w:r>
+        <w:rPr>
+          <w:b/>
+          <w:sz w:val="24"/>
+          <w:szCs w:val="24"/>
+        </w:rPr>
+        <w:t xml:space="preserve">Logical Topology: </w:t>
+      </w:r>
+    </w:p>
+    <w:p>
+      <w:pPr>
+        <w:rPr>
+          <w:sz w:val="24"/>
+          <w:szCs w:val="24"/>
+        </w:rPr>
+      </w:pPr>
+      <w:r>
+        <w:rPr>
+          <w:sz w:val="24"/>
+          <w:szCs w:val="24"/>
+        </w:rPr>
+        <w:t>Refers to how data actually moves across the network regardless of the physical layout.</w:t>
+      </w:r>
+    </w:p>
+    <w:p>
+      <w:pPr>
+        <w:rPr>
+          <w:sz w:val="24"/>
+          <w:szCs w:val="24"/>
+        </w:rPr>
+      </w:pPr>
+    </w:p>
+    <w:p>
+      <w:pPr>
+        <w:rPr>
+          <w:sz w:val="24"/>
+          <w:szCs w:val="24"/>
+        </w:rPr>
+      </w:pPr>
+      <w:r>
+        <w:rPr>
+          <w:sz w:val="24"/>
+          <w:szCs w:val="24"/>
+        </w:rPr>
+        <w:t>Question:</w:t>
+      </w:r>
+    </w:p>
+    <w:p>
+      <w:pPr>
+        <w:rPr>
+          <w:sz w:val="24"/>
+          <w:szCs w:val="24"/>
+        </w:rPr>
+      </w:pPr>
+      <w:r>
+        <w:rPr>
+          <w:sz w:val="24"/>
+          <w:szCs w:val="24"/>
+        </w:rPr>
+        <w:t>1. A network is physically arranged in a star topology but uses a hub. What is its logical topology?</w:t>
+      </w:r>
+    </w:p>
+    <w:p>
+      <w:pPr>
+        <w:rPr>
+          <w:b/>
+          <w:sz w:val="24"/>
+          <w:szCs w:val="24"/>
+        </w:rPr>
+      </w:pPr>
+      <w:r>
+        <w:rPr>
+          <w:sz w:val="24"/>
+          <w:szCs w:val="24"/>
+        </w:rPr>
+        <w:t xml:space="preserve">The logical topology is </w:t>
+      </w:r>
+      <w:r>
+        <w:rPr>
+          <w:b/>
+          <w:sz w:val="24"/>
+          <w:szCs w:val="24"/>
+        </w:rPr>
+        <w:t>Bus</w:t>
+      </w:r>
+      <w:r>
+        <w:rPr>
+          <w:b/>
+          <w:sz w:val="24"/>
+          <w:szCs w:val="24"/>
+        </w:rPr>
+        <w:t>.</w:t>
+      </w:r>
+    </w:p>
+    <w:p>
+      <w:pPr>
+        <w:rPr>
+          <w:sz w:val="24"/>
+          <w:szCs w:val="24"/>
+        </w:rPr>
+      </w:pPr>
+      <w:r>
+        <w:rPr>
+          <w:sz w:val="24"/>
+          <w:szCs w:val="24"/>
+        </w:rPr>
+        <w:t>Because a hub broadcasts data to all connected devices. Similar to how data is transmitted in a bus topology.</w:t>
+      </w:r>
+    </w:p>
+    <w:p>
+      <w:pPr>
+        <w:rPr>
+          <w:sz w:val="24"/>
+          <w:szCs w:val="24"/>
+        </w:rPr>
+      </w:pPr>
+    </w:p>
+    <w:p>
+      <w:pPr>
+        <w:rPr>
+          <w:sz w:val="24"/>
+          <w:szCs w:val="24"/>
+        </w:rPr>
+      </w:pPr>
+      <w:r>
+        <w:rPr>
+          <w:sz w:val="24"/>
+          <w:szCs w:val="24"/>
+        </w:rPr>
+        <w:t>2. A network uses a switch and is arranged in a star topology. What is its logical topology?</w:t>
+      </w:r>
+    </w:p>
+    <w:p>
+      <w:pPr>
+        <w:rPr>
+          <w:b/>
+          <w:sz w:val="24"/>
+          <w:szCs w:val="24"/>
+        </w:rPr>
+      </w:pPr>
+      <w:r>
+        <w:rPr>
+          <w:sz w:val="24"/>
+          <w:szCs w:val="24"/>
+        </w:rPr>
+        <w:t xml:space="preserve">The logical topology is </w:t>
+      </w:r>
+      <w:r>
+        <w:rPr>
+          <w:b/>
+          <w:sz w:val="24"/>
+          <w:szCs w:val="24"/>
+        </w:rPr>
+        <w:t>Star</w:t>
+      </w:r>
+      <w:r>
+        <w:rPr>
+          <w:b/>
+          <w:sz w:val="24"/>
+          <w:szCs w:val="24"/>
+        </w:rPr>
+        <w:t>.</w:t>
+      </w:r>
+    </w:p>
+    <w:p>
+      <w:pPr>
+        <w:rPr>
+          <w:sz w:val="24"/>
+          <w:szCs w:val="24"/>
+        </w:rPr>
+      </w:pPr>
+      <w:r>
+        <w:rPr>
+          <w:sz w:val="24"/>
+          <w:szCs w:val="24"/>
+        </w:rPr>
+        <w:t>Because switch sends data only to the intended destination device.</w:t>
+      </w:r>
+    </w:p>
+    <w:p>
+      <w:pPr>
+        <w:rPr>
+          <w:sz w:val="24"/>
+          <w:szCs w:val="24"/>
+        </w:rPr>
+      </w:pPr>
+    </w:p>
+    <w:p>
+      <w:pPr>
+        <w:rPr>
+          <w:sz w:val="24"/>
+          <w:szCs w:val="24"/>
+        </w:rPr>
+      </w:pPr>
+      <w:r>
+        <w:rPr>
+          <w:sz w:val="24"/>
+          <w:szCs w:val="24"/>
+        </w:rPr>
+        <w:t xml:space="preserve">3. Why is logical </w:t>
+      </w:r>
+      <w:r>
+        <w:rPr>
+          <w:sz w:val="24"/>
+          <w:szCs w:val="24"/>
+        </w:rPr>
+        <w:t>topology more important than physical topology in understanding network behavior?</w:t>
+      </w:r>
+    </w:p>
+    <w:p>
+      <w:pPr>
+        <w:rPr>
+          <w:sz w:val="24"/>
+          <w:szCs w:val="24"/>
+        </w:rPr>
+      </w:pPr>
+      <w:r>
+        <w:rPr>
+          <w:sz w:val="24"/>
+          <w:szCs w:val="24"/>
+        </w:rPr>
+        <w:t>Logical topology is more important because it defines how data flows between devices.</w:t>
+      </w:r>
+    </w:p>
+    <w:p>
+      <w:pPr>
+        <w:rPr>
+          <w:sz w:val="24"/>
+          <w:szCs w:val="24"/>
+        </w:rPr>
+      </w:pPr>
+      <w:r>
+        <w:rPr>
+          <w:sz w:val="24"/>
+          <w:szCs w:val="24"/>
+        </w:rPr>
+        <w:t>Network performance, efficiency, and troubleshooting depend on how data moves rather than how devices are physically connected.</w:t>
+      </w:r>
+    </w:p>
+    <w:p>
+      <w:pPr>
+        <w:rPr>
+          <w:sz w:val="24"/>
+          <w:szCs w:val="24"/>
+        </w:rPr>
+      </w:pPr>
+    </w:p>
+    <w:p>
+      <w:pPr>
+        <w:rPr>
+          <w:sz w:val="24"/>
+          <w:szCs w:val="24"/>
+        </w:rPr>
+      </w:pPr>
+      <w:r>
+        <w:rPr>
+          <w:sz w:val="24"/>
+          <w:szCs w:val="24"/>
+        </w:rPr>
+        <w:t>Question:</w:t>
+      </w:r>
+    </w:p>
+    <w:p>
+      <w:pPr>
+        <w:rPr>
+          <w:sz w:val="24"/>
+          <w:szCs w:val="24"/>
+        </w:rPr>
+      </w:pPr>
+      <w:r>
+        <w:rPr>
+          <w:sz w:val="24"/>
+          <w:szCs w:val="24"/>
+        </w:rPr>
+        <w:t>Design a network for a school computer lab that consists of 10 student computers, 1 teacher computer, and 1 network printer. All devices should be connected using a switch in a star topology to form a Local Area Network (LAN). The network must allow all computers to communicate with each other and share the printer.</w:t>
+      </w:r>
+    </w:p>
+    <w:p>
+      <w:pPr>
+        <w:rPr>
+          <w:sz w:val="24"/>
+          <w:szCs w:val="24"/>
+        </w:rPr>
+      </w:pPr>
+    </w:p>
+    <w:p>
+      <w:pPr>
+        <w:rPr>
+          <w:b/>
+          <w:sz w:val="24"/>
+          <w:szCs w:val="24"/>
+        </w:rPr>
+      </w:pPr>
+      <w:r>
+        <w:rPr>
+          <w:b/>
+          <w:sz w:val="24"/>
+          <w:szCs w:val="24"/>
+        </w:rPr>
+        <w:t>Packets</w:t>
+      </w:r>
+    </w:p>
+    <w:p>
+      <w:pPr>
+        <w:rPr>
+          <w:sz w:val="24"/>
+          <w:szCs w:val="24"/>
+        </w:rPr>
+      </w:pPr>
+      <w:r>
+        <w:rPr>
+          <w:sz w:val="24"/>
+          <w:szCs w:val="24"/>
+        </w:rPr>
+        <w:lastRenderedPageBreak/>
+        <w:t>When data transfers through a network, it is not sent as a single large block. Instead, it is divided into smaller units called packets.</w:t>
+      </w:r>
+    </w:p>
+    <w:p>
+      <w:pPr>
+        <w:rPr>
+          <w:sz w:val="24"/>
+          <w:szCs w:val="24"/>
+        </w:rPr>
+      </w:pPr>
+      <w:r>
+        <w:rPr>
+          <w:sz w:val="24"/>
+          <w:szCs w:val="24"/>
+        </w:rPr>
+        <w:t>Packets are transmitted separately across the network and may take different paths. At the destination, they are reassembled in the correct order to form the original message.</w:t>
+      </w:r>
+    </w:p>
+    <w:p>
+      <w:pPr>
+        <w:rPr>
+          <w:sz w:val="24"/>
+          <w:szCs w:val="24"/>
+        </w:rPr>
+      </w:pPr>
+      <w:r>
+        <w:rPr>
+          <w:sz w:val="24"/>
+          <w:szCs w:val="24"/>
+        </w:rPr>
+        <w:t>This method is called packet switching.</w:t>
+      </w:r>
+    </w:p>
+    <w:p>
+      <w:pPr>
+        <w:rPr>
+          <w:sz w:val="24"/>
+          <w:szCs w:val="24"/>
+        </w:rPr>
+      </w:pPr>
+      <w:r>
+        <w:rPr>
+          <w:sz w:val="24"/>
+          <w:szCs w:val="24"/>
+        </w:rPr>
+        <w:t>Question:</w:t>
+      </w:r>
+    </w:p>
+    <w:p>
+      <w:pPr>
+        <w:rPr>
+          <w:sz w:val="24"/>
+          <w:szCs w:val="24"/>
+        </w:rPr>
+      </w:pPr>
+      <w:r>
+        <w:rPr>
+          <w:sz w:val="24"/>
+          <w:szCs w:val="24"/>
+        </w:rPr>
+        <w:t>Compare and contrast packet switching and circuit switching.</w:t>
+      </w:r>
+    </w:p>
+    <w:p>
+      <w:pPr>
+        <w:rPr>
+          <w:sz w:val="24"/>
+          <w:szCs w:val="24"/>
+        </w:rPr>
+      </w:pPr>
+      <w:r>
+        <w:rPr>
+          <w:sz w:val="24"/>
+          <w:szCs w:val="24"/>
+        </w:rPr>
+        <w:t>Packet switching and circuit switching are two fundamental methods of data transmission.</w:t>
+      </w:r>
+    </w:p>
+    <w:p>
+      <w:pPr>
+        <w:rPr>
+          <w:sz w:val="24"/>
+          <w:szCs w:val="24"/>
+        </w:rPr>
+      </w:pPr>
+      <w:r>
+        <w:rPr>
+          <w:sz w:val="24"/>
+          <w:szCs w:val="24"/>
+        </w:rPr>
+        <w:t>In circuit switching, a dedicated communication path is established between sender and receiver before any data is transmitted, and this path remains reserved for the entire session, even during idle periods</w:t>
+      </w:r>
+    </w:p>
+    <w:p>
+      <w:pPr>
+        <w:rPr>
+          <w:sz w:val="24"/>
+          <w:szCs w:val="24"/>
+        </w:rPr>
+      </w:pPr>
+      <w:r>
+        <w:rPr>
+          <w:sz w:val="24"/>
+          <w:szCs w:val="24"/>
+        </w:rPr>
+        <w:t>Example: Traditional telephone systems.</w:t>
+      </w:r>
+    </w:p>
+    <w:p>
+      <w:pPr>
+        <w:rPr>
+          <w:sz w:val="24"/>
+          <w:szCs w:val="24"/>
+        </w:rPr>
+      </w:pPr>
+      <w:r>
+        <w:rPr>
+          <w:sz w:val="24"/>
+          <w:szCs w:val="24"/>
+        </w:rPr>
+        <w:t>This results in fixed delay and data arriving in order, but it is inefficient because bandwidth is wasted when no data is being sent.</w:t>
+      </w:r>
+    </w:p>
+    <w:p>
+      <w:pPr>
+        <w:rPr>
+          <w:sz w:val="24"/>
+          <w:szCs w:val="24"/>
+        </w:rPr>
+      </w:pPr>
+      <w:r>
+        <w:rPr>
+          <w:sz w:val="24"/>
+          <w:szCs w:val="24"/>
+        </w:rPr>
+        <w:t>P</w:t>
+      </w:r>
+      <w:r>
+        <w:rPr>
+          <w:sz w:val="24"/>
+          <w:szCs w:val="24"/>
+        </w:rPr>
+        <w:t>acket switching breaks data into smaller packets</w:t>
+      </w:r>
+      <w:r>
+        <w:rPr>
+          <w:sz w:val="24"/>
+          <w:szCs w:val="24"/>
+        </w:rPr>
+        <w:t>.</w:t>
+      </w:r>
+    </w:p>
+    <w:p>
+      <w:pPr>
+        <w:rPr>
+          <w:sz w:val="24"/>
+          <w:szCs w:val="24"/>
+        </w:rPr>
+      </w:pPr>
+      <w:r>
+        <w:rPr>
+          <w:sz w:val="24"/>
+          <w:szCs w:val="24"/>
+        </w:rPr>
+        <w:t xml:space="preserve">Each packet </w:t>
+      </w:r>
+      <w:r>
+        <w:rPr>
+          <w:sz w:val="24"/>
+          <w:szCs w:val="24"/>
+        </w:rPr>
+        <w:t>travel independently across the network via different routes and be reassembled at the destination.</w:t>
+      </w:r>
+    </w:p>
+    <w:p>
+      <w:pPr>
+        <w:rPr>
+          <w:sz w:val="24"/>
+          <w:szCs w:val="24"/>
+        </w:rPr>
+      </w:pPr>
+      <w:r>
+        <w:rPr>
+          <w:sz w:val="24"/>
+          <w:szCs w:val="24"/>
+        </w:rPr>
+        <w:t>No dedicated path is reserved.</w:t>
+      </w:r>
+      <w:r>
+        <w:rPr>
+          <w:sz w:val="24"/>
+          <w:szCs w:val="24"/>
+        </w:rPr>
+        <w:t xml:space="preserve"> </w:t>
+      </w:r>
+    </w:p>
+    <w:p>
+      <w:pPr>
+        <w:rPr>
+          <w:sz w:val="24"/>
+          <w:szCs w:val="24"/>
+        </w:rPr>
+      </w:pPr>
+      <w:r>
+        <w:rPr>
+          <w:sz w:val="24"/>
+          <w:szCs w:val="24"/>
+        </w:rPr>
+        <w:t>N</w:t>
+      </w:r>
+      <w:r>
+        <w:rPr>
+          <w:sz w:val="24"/>
+          <w:szCs w:val="24"/>
+        </w:rPr>
+        <w:t>etwork resources are used only when packets are actually transmitted</w:t>
+      </w:r>
+      <w:r>
+        <w:rPr>
+          <w:sz w:val="24"/>
+          <w:szCs w:val="24"/>
+        </w:rPr>
+        <w:t>.</w:t>
+      </w:r>
+    </w:p>
+    <w:p>
+      <w:pPr>
+        <w:rPr>
+          <w:sz w:val="24"/>
+          <w:szCs w:val="24"/>
+        </w:rPr>
+      </w:pPr>
+      <w:r>
+        <w:rPr>
+          <w:sz w:val="24"/>
+          <w:szCs w:val="24"/>
+        </w:rPr>
+        <w:t>Packet switching is more efficient</w:t>
+      </w:r>
+      <w:r>
+        <w:rPr>
+          <w:sz w:val="24"/>
+          <w:szCs w:val="24"/>
+        </w:rPr>
+        <w:t xml:space="preserve"> and reliable</w:t>
+      </w:r>
+      <w:r>
+        <w:rPr>
+          <w:sz w:val="24"/>
+          <w:szCs w:val="24"/>
+        </w:rPr>
+        <w:t>.</w:t>
+      </w:r>
+    </w:p>
+    <w:p>
+      <w:pPr>
+        <w:rPr>
+          <w:sz w:val="24"/>
+          <w:szCs w:val="24"/>
+        </w:rPr>
+      </w:pPr>
+      <w:r>
+        <w:rPr>
+          <w:sz w:val="24"/>
+          <w:szCs w:val="24"/>
+        </w:rPr>
+        <w:t xml:space="preserve">Packet switching has variable delay. Packets may arrive out of order. </w:t>
+      </w:r>
+      <w:r>
+        <w:rPr>
+          <w:sz w:val="24"/>
+          <w:szCs w:val="24"/>
+        </w:rPr>
+        <w:t>Requires reassembly.</w:t>
+      </w:r>
+    </w:p>
+    <w:p>
+      <w:pPr>
+        <w:rPr>
+          <w:sz w:val="24"/>
+          <w:szCs w:val="24"/>
+        </w:rPr>
+      </w:pPr>
+      <w:r>
+        <w:rPr>
+          <w:sz w:val="24"/>
+          <w:szCs w:val="24"/>
+        </w:rPr>
+        <w:t>Packet switching is the foundation of the modern internet.</w:t>
+      </w:r>
+      <w:r>
+        <w:rPr>
+          <w:sz w:val="24"/>
+          <w:szCs w:val="24"/>
+        </w:rPr>
+        <w:t xml:space="preserve"> </w:t>
+      </w:r>
+    </w:p>
+    <w:p>
+      <w:pPr>
+        <w:rPr>
+          <w:sz w:val="24"/>
+          <w:szCs w:val="24"/>
+        </w:rPr>
+      </w:pPr>
+      <w:r>
+        <w:rPr>
+          <w:sz w:val="24"/>
+          <w:szCs w:val="24"/>
+        </w:rPr>
+        <w:t>Question:</w:t>
+      </w:r>
+    </w:p>
+    <w:p>
+      <w:pPr>
+        <w:rPr>
+          <w:sz w:val="24"/>
+          <w:szCs w:val="24"/>
+        </w:rPr>
+      </w:pPr>
+      <w:r>
+        <w:rPr>
+          <w:sz w:val="24"/>
+          <w:szCs w:val="24"/>
+        </w:rPr>
+        <w:t>Each device in a network has a unique MAC address assigned to its NIC. Is the MAC address alone sufficient for communication in all types of networks?</w:t>
+      </w:r>
+    </w:p>
+    <w:p>
+      <w:pPr>
+        <w:rPr>
+          <w:sz w:val="24"/>
+          <w:szCs w:val="24"/>
+        </w:rPr>
+      </w:pPr>
+      <w:r>
+        <w:rPr>
+          <w:sz w:val="24"/>
+          <w:szCs w:val="24"/>
+        </w:rPr>
+        <w:t>MAC addresses alone are not sufficient for communication across multiple networks. Because MAC addresses do not provide any information about the location or network to which a device belongs.</w:t>
+      </w:r>
+    </w:p>
+    <w:p>
+      <w:pPr>
+        <w:rPr>
+          <w:sz w:val="24"/>
+          <w:szCs w:val="24"/>
+        </w:rPr>
+      </w:pPr>
+      <w:r>
+        <w:rPr>
+          <w:sz w:val="24"/>
+          <w:szCs w:val="24"/>
+        </w:rPr>
+        <w:t>Cannot use MAC address to determine the path for data to travel.</w:t>
+      </w:r>
+    </w:p>
+    <w:p>
+      <w:pPr>
+        <w:rPr>
+          <w:sz w:val="24"/>
+          <w:szCs w:val="24"/>
+        </w:rPr>
+      </w:pPr>
+      <w:r>
+        <w:rPr>
+          <w:sz w:val="24"/>
+          <w:szCs w:val="24"/>
+        </w:rPr>
+        <w:t>Solution: IP Addresses</w:t>
+      </w:r>
+    </w:p>
+    <w:p>
+      <w:pPr>
+        <w:rPr>
+          <w:sz w:val="24"/>
+          <w:szCs w:val="24"/>
+        </w:rPr>
+      </w:pPr>
+    </w:p>
+    <w:p>
+      <w:pPr>
+        <w:rPr>
+          <w:b/>
+          <w:sz w:val="24"/>
+          <w:szCs w:val="24"/>
+        </w:rPr>
+      </w:pPr>
+      <w:r>
+        <w:rPr>
+          <w:b/>
+          <w:sz w:val="24"/>
+          <w:szCs w:val="24"/>
+        </w:rPr>
+        <w:t>IP Address</w:t>
+      </w:r>
+    </w:p>
+    <w:p>
+      <w:pPr>
+        <w:rPr>
+          <w:sz w:val="24"/>
+          <w:szCs w:val="24"/>
+        </w:rPr>
+      </w:pPr>
+      <w:r>
+        <w:rPr>
+          <w:sz w:val="24"/>
+          <w:szCs w:val="24"/>
+        </w:rPr>
+        <w:t xml:space="preserve"> </w:t>
+      </w:r>
+      <w:r>
+        <w:rPr>
+          <w:sz w:val="24"/>
+          <w:szCs w:val="24"/>
+        </w:rPr>
+        <w:t>An IP address (Internet Protocol Address) is a unique numerical identifier assigned to each device connected to a network</w:t>
+      </w:r>
+      <w:r>
+        <w:rPr>
+          <w:sz w:val="24"/>
+          <w:szCs w:val="24"/>
+        </w:rPr>
+        <w:t>.</w:t>
+      </w:r>
+    </w:p>
+    <w:p>
+      <w:pPr>
+        <w:rPr>
+          <w:sz w:val="24"/>
+          <w:szCs w:val="24"/>
+        </w:rPr>
+      </w:pPr>
+      <w:r>
+        <w:rPr>
+          <w:sz w:val="24"/>
+          <w:szCs w:val="24"/>
+        </w:rPr>
+        <w:t>Use</w:t>
+      </w:r>
+      <w:r>
+        <w:rPr>
+          <w:sz w:val="24"/>
+          <w:szCs w:val="24"/>
+        </w:rPr>
+        <w:t xml:space="preserve"> to uniquely identify a device on the network and to determine where the device is located in the network, so data can be sent to and from it.</w:t>
+      </w:r>
+    </w:p>
+    <w:p>
+      <w:pPr>
+        <w:rPr>
+          <w:sz w:val="24"/>
+          <w:szCs w:val="24"/>
+        </w:rPr>
+      </w:pPr>
+      <w:r>
+        <w:rPr>
+          <w:sz w:val="24"/>
+          <w:szCs w:val="24"/>
+        </w:rPr>
+        <w:t>Example:</w:t>
+      </w:r>
+    </w:p>
+    <w:p>
+      <w:pPr>
+        <w:rPr>
+          <w:sz w:val="24"/>
+          <w:szCs w:val="24"/>
+        </w:rPr>
+      </w:pPr>
+      <w:r>
+        <w:rPr>
+          <w:sz w:val="24"/>
+          <w:szCs w:val="24"/>
+        </w:rPr>
+        <w:t>IPV4 – 192.168.1.1</w:t>
+      </w:r>
+    </w:p>
+    <w:p>
+      <w:pPr>
+        <w:rPr>
+          <w:sz w:val="24"/>
+          <w:szCs w:val="24"/>
+        </w:rPr>
+      </w:pPr>
+      <w:r>
+        <w:rPr>
+          <w:sz w:val="24"/>
+          <w:szCs w:val="24"/>
+        </w:rPr>
+        <w:lastRenderedPageBreak/>
+        <w:t xml:space="preserve">     IPV6 - 2001:0db8:85a3:0000:0000:8a2e:0370:7334</w:t>
+      </w:r>
+    </w:p>
+    <w:p>
+      <w:pPr>
+        <w:rPr>
+          <w:sz w:val="24"/>
+          <w:szCs w:val="24"/>
+        </w:rPr>
+      </w:pPr>
+    </w:p>
+    <w:p>
+      <w:pPr>
+        <w:rPr>
+          <w:b/>
+          <w:sz w:val="24"/>
+          <w:szCs w:val="24"/>
+        </w:rPr>
+      </w:pPr>
+      <w:r>
+        <w:rPr>
+          <w:b/>
+          <w:sz w:val="24"/>
+          <w:szCs w:val="24"/>
+        </w:rPr>
+        <w:t>Layered Network Architecture</w:t>
+      </w:r>
+    </w:p>
+    <w:p>
+      <w:pPr>
+        <w:rPr>
+          <w:sz w:val="24"/>
+          <w:szCs w:val="24"/>
+        </w:rPr>
+      </w:pPr>
+      <w:r>
+        <w:rPr>
+          <w:sz w:val="24"/>
+          <w:szCs w:val="24"/>
+        </w:rPr>
+        <w:t xml:space="preserve">Layering is a technique </w:t>
+      </w:r>
+      <w:r>
+        <w:rPr>
+          <w:sz w:val="24"/>
+          <w:szCs w:val="24"/>
+        </w:rPr>
+        <w:t>used to divide network communication into multiple layers</w:t>
+      </w:r>
+      <w:r>
+        <w:rPr>
+          <w:sz w:val="24"/>
+          <w:szCs w:val="24"/>
+        </w:rPr>
+        <w:t>.</w:t>
+      </w:r>
+    </w:p>
+    <w:p>
+      <w:pPr>
+        <w:rPr>
+          <w:sz w:val="24"/>
+          <w:szCs w:val="24"/>
+        </w:rPr>
+      </w:pPr>
+      <w:r>
+        <w:rPr>
+          <w:sz w:val="24"/>
+          <w:szCs w:val="24"/>
+        </w:rPr>
+        <w:t>Each layer performs a specific function.</w:t>
+      </w:r>
+    </w:p>
+    <w:p>
+      <w:pPr>
+        <w:rPr>
+          <w:sz w:val="24"/>
+          <w:szCs w:val="24"/>
+        </w:rPr>
+      </w:pPr>
+      <w:r>
+        <w:rPr>
+          <w:sz w:val="24"/>
+          <w:szCs w:val="24"/>
+        </w:rPr>
+        <w:t>Layered network architecture was introduced to overcome the limitations of proprietary systems</w:t>
+      </w:r>
+      <w:r>
+        <w:rPr>
+          <w:sz w:val="24"/>
+          <w:szCs w:val="24"/>
+        </w:rPr>
+        <w:t>.</w:t>
+      </w:r>
+    </w:p>
+    <w:p>
+      <w:pPr>
+        <w:rPr>
+          <w:sz w:val="24"/>
+          <w:szCs w:val="24"/>
+        </w:rPr>
+      </w:pPr>
+    </w:p>
+    <w:p>
+      <w:pPr>
+        <w:rPr>
+          <w:b/>
+          <w:sz w:val="24"/>
+          <w:szCs w:val="24"/>
+        </w:rPr>
+      </w:pPr>
+      <w:r>
+        <w:rPr>
+          <w:b/>
+          <w:sz w:val="24"/>
+          <w:szCs w:val="24"/>
+        </w:rPr>
+        <w:t>Prop</w:t>
+      </w:r>
+      <w:r>
+        <w:rPr>
+          <w:b/>
+          <w:sz w:val="24"/>
+          <w:szCs w:val="24"/>
+        </w:rPr>
+        <w:t>rietary systems</w:t>
+      </w:r>
+      <w:r>
+        <w:rPr>
+          <w:b/>
+          <w:sz w:val="24"/>
+          <w:szCs w:val="24"/>
+        </w:rPr>
+        <w:t>.</w:t>
+      </w:r>
+    </w:p>
+    <w:p>
+      <w:pPr>
+        <w:rPr>
+          <w:sz w:val="24"/>
+          <w:szCs w:val="24"/>
+        </w:rPr>
+      </w:pPr>
+      <w:r>
+        <w:rPr>
+          <w:sz w:val="24"/>
+          <w:szCs w:val="24"/>
+        </w:rPr>
+        <w:t>In the early days of computing, different companies such as IBM, Apple, and Microsoft developed their own communication systems. These were known as proprietary systems because they were designed to work only with that compa</w:t>
+      </w:r>
+      <w:r>
+        <w:rPr>
+          <w:sz w:val="24"/>
+          <w:szCs w:val="24"/>
+        </w:rPr>
+        <w:t>ny’s own hardware and software.</w:t>
+      </w:r>
+    </w:p>
+    <w:p>
+      <w:pPr>
+        <w:rPr>
+          <w:sz w:val="24"/>
+          <w:szCs w:val="24"/>
+        </w:rPr>
+      </w:pPr>
+      <w:r>
+        <w:rPr>
+          <w:sz w:val="24"/>
+          <w:szCs w:val="24"/>
+        </w:rPr>
+        <w:t>In proprietary systems, each manufacturer used its own rules, formats, and protocols for communication. As a result, devices from different vendors could not easily communicate with each other.</w:t>
+      </w:r>
+    </w:p>
+    <w:p>
+      <w:pPr>
+        <w:rPr>
+          <w:sz w:val="24"/>
+          <w:szCs w:val="24"/>
+        </w:rPr>
+      </w:pPr>
+      <w:r>
+        <w:rPr>
+          <w:sz w:val="24"/>
+          <w:szCs w:val="24"/>
+        </w:rPr>
+        <w:t>Example:</w:t>
+      </w:r>
+    </w:p>
+    <w:p>
+      <w:pPr>
+        <w:rPr>
+          <w:sz w:val="24"/>
+          <w:szCs w:val="24"/>
+        </w:rPr>
+      </w:pPr>
+      <w:r>
+        <w:rPr>
+          <w:sz w:val="24"/>
+          <w:szCs w:val="24"/>
+        </w:rPr>
+        <w:t>IBM systems could communicate only with other IBM systems</w:t>
+      </w:r>
+    </w:p>
+    <w:p>
+      <w:pPr>
+        <w:rPr>
+          <w:sz w:val="24"/>
+          <w:szCs w:val="24"/>
+        </w:rPr>
+      </w:pPr>
+      <w:r>
+        <w:rPr>
+          <w:sz w:val="24"/>
+          <w:szCs w:val="24"/>
+        </w:rPr>
+        <w:t>Apple devices could not easily connect with Windows-based systems</w:t>
+      </w:r>
+    </w:p>
+    <w:p>
+      <w:pPr>
+        <w:rPr>
+          <w:sz w:val="24"/>
+          <w:szCs w:val="24"/>
+        </w:rPr>
+      </w:pPr>
+    </w:p>
+    <w:p>
+      <w:pPr>
+        <w:rPr>
+          <w:sz w:val="24"/>
+          <w:szCs w:val="24"/>
+        </w:rPr>
+      </w:pPr>
+      <w:r>
+        <w:rPr>
+          <w:sz w:val="24"/>
+          <w:szCs w:val="24"/>
+        </w:rPr>
+        <w:t>Question:</w:t>
+      </w:r>
+    </w:p>
+    <w:p>
+      <w:pPr>
+        <w:rPr>
+          <w:sz w:val="24"/>
+          <w:szCs w:val="24"/>
+        </w:rPr>
+      </w:pPr>
+      <w:r>
+        <w:rPr>
+          <w:sz w:val="24"/>
+          <w:szCs w:val="24"/>
+        </w:rPr>
+        <w:t xml:space="preserve">How layered network architecture solves the problem </w:t>
+      </w:r>
+      <w:r>
+        <w:rPr>
+          <w:sz w:val="24"/>
+          <w:szCs w:val="24"/>
+        </w:rPr>
+        <w:t>of proprietary systems?</w:t>
+      </w:r>
+    </w:p>
+    <w:p>
+      <w:pPr>
+        <w:rPr>
+          <w:sz w:val="24"/>
+          <w:szCs w:val="24"/>
+        </w:rPr>
+      </w:pPr>
+      <w:r>
+        <w:rPr>
+          <w:sz w:val="24"/>
+          <w:szCs w:val="24"/>
+        </w:rPr>
+        <w:t xml:space="preserve">Layered network architecture solves the problem of proprietary systems by introducing standard rules at each layer of communication. </w:t>
+      </w:r>
+    </w:p>
+    <w:p>
+      <w:pPr>
+        <w:rPr>
+          <w:sz w:val="24"/>
+          <w:szCs w:val="24"/>
+        </w:rPr>
+      </w:pPr>
+      <w:r>
+        <w:rPr>
+          <w:sz w:val="24"/>
+          <w:szCs w:val="24"/>
+        </w:rPr>
+        <w:t xml:space="preserve">Instead of each company using its own complete system, all devices follow the same set of protocols at each layer. </w:t>
+      </w:r>
+    </w:p>
+    <w:p>
+      <w:pPr>
+        <w:rPr>
+          <w:sz w:val="24"/>
+          <w:szCs w:val="24"/>
+        </w:rPr>
+      </w:pPr>
+      <w:r>
+        <w:rPr>
+          <w:sz w:val="24"/>
+          <w:szCs w:val="24"/>
+        </w:rPr>
+        <w:t>This ensures that even devices from different manufacturers can communicate with each other, as they understand the same formats, addressing methods, and transmission rules.</w:t>
+      </w:r>
+    </w:p>
+    <w:p>
+      <w:pPr>
+        <w:rPr>
+          <w:sz w:val="24"/>
+          <w:szCs w:val="24"/>
+        </w:rPr>
+      </w:pPr>
+    </w:p>
+    <w:p>
+      <w:pPr>
+        <w:rPr>
+          <w:b/>
+          <w:sz w:val="24"/>
+          <w:szCs w:val="24"/>
+        </w:rPr>
+      </w:pPr>
+      <w:r>
+        <w:rPr>
+          <w:b/>
+          <w:sz w:val="24"/>
+          <w:szCs w:val="24"/>
+        </w:rPr>
+        <w:t>OSI Model</w:t>
+      </w:r>
+    </w:p>
+    <w:p>
+      <w:pPr>
+        <w:rPr>
+          <w:sz w:val="24"/>
+          <w:szCs w:val="24"/>
+        </w:rPr>
+      </w:pPr>
+      <w:r>
+        <w:rPr>
+          <w:sz w:val="24"/>
+          <w:szCs w:val="24"/>
+        </w:rPr>
+        <w:t>The Open Systems Interconnection (OSI) model was developed by the International Organization for Standardization (ISO) to standardize communication between different computer systems.</w:t>
+      </w:r>
+    </w:p>
+    <w:p>
+      <w:pPr>
+        <w:rPr>
+          <w:sz w:val="24"/>
+          <w:szCs w:val="24"/>
+        </w:rPr>
+      </w:pPr>
+      <w:r>
+        <w:rPr>
+          <w:sz w:val="24"/>
+          <w:szCs w:val="24"/>
+        </w:rPr>
+        <w:t>OSI Model has 7 layers.</w:t>
+      </w:r>
+    </w:p>
+    <w:p>
+      <w:pPr>
+        <w:rPr>
+          <w:sz w:val="24"/>
+          <w:szCs w:val="24"/>
+        </w:rPr>
+      </w:pPr>
+      <w:r>
+        <w:rPr>
+          <w:sz w:val="24"/>
+          <w:szCs w:val="24"/>
+        </w:rPr>
+        <w:lastRenderedPageBreak/>
         <w:drawing>
-          <wp:inline distT="0" distB="0" distL="0" distR="0" wp14:anchorId="7CBD1F6E" wp14:editId="058ECBA6">
-            <wp:extent cx="2572109" cy="4248743"/>
+          <wp:inline distT="0" distB="0" distL="0" distR="0" wp14:anchorId="2AF3B69E" wp14:editId="705FE1F5">
+            <wp:extent cx="2743200" cy="4290060"/>
             <wp:effectExtent l="0" t="0" r="0" b="0"/>
-            <wp:docPr id="11" name="Picture 11"/>
+            <wp:docPr id="6" name="Picture 6"/>
             <wp:cNvGraphicFramePr>
               <a:graphicFrameLocks xmlns:a="http://schemas.openxmlformats.org/drawingml/2006/main" noChangeAspect="1"/>
             </wp:cNvGraphicFramePr>
@@ -2880,7 +5571,7 @@
                   <pic:spPr>
                     <a:xfrm>
                       <a:off x="0" y="0"/>
-                      <a:ext cx="2572109" cy="4248743"/>
+                      <a:ext cx="2743200" cy="4290060"/>
                     </a:xfrm>
                     <a:prstGeom prst="rect">
                       <a:avLst/>
@@ -2913,87 +5604,263 @@
           <w:sz w:val="24"/>
           <w:szCs w:val="24"/>
         </w:rPr>
-        <w:t>Speed – Bits / Second</w:t>
-      </w:r>
-    </w:p>
-    <w:p>
-      <w:pPr>
-        <w:rPr>
-          <w:sz w:val="24"/>
-          <w:szCs w:val="24"/>
-        </w:rPr>
-      </w:pPr>
-    </w:p>
-    <w:p>
-      <w:pPr>
-        <w:rPr>
-          <w:sz w:val="24"/>
-          <w:szCs w:val="24"/>
-        </w:rPr>
-      </w:pPr>
-    </w:p>
-    <w:p>
-      <w:pPr>
-        <w:rPr>
-          <w:sz w:val="24"/>
-          <w:szCs w:val="24"/>
-        </w:rPr>
-      </w:pPr>
-    </w:p>
-    <w:p>
-      <w:pPr>
-        <w:rPr>
-          <w:sz w:val="24"/>
-          <w:szCs w:val="24"/>
-        </w:rPr>
-      </w:pPr>
-    </w:p>
-    <w:p>
-      <w:pPr>
-        <w:rPr>
-          <w:sz w:val="24"/>
-          <w:szCs w:val="24"/>
-        </w:rPr>
-      </w:pPr>
-    </w:p>
-    <w:p>
-      <w:pPr>
-        <w:rPr>
-          <w:sz w:val="24"/>
-          <w:szCs w:val="24"/>
-        </w:rPr>
-      </w:pPr>
-    </w:p>
-    <w:p>
-      <w:pPr>
-        <w:rPr>
-          <w:sz w:val="24"/>
-          <w:szCs w:val="24"/>
-        </w:rPr>
-      </w:pPr>
-    </w:p>
-    <w:p>
-      <w:pPr>
-        <w:rPr>
-          <w:sz w:val="24"/>
-          <w:szCs w:val="24"/>
-        </w:rPr>
-      </w:pPr>
-    </w:p>
-    <w:p>
-      <w:pPr>
-        <w:rPr>
-          <w:sz w:val="24"/>
-          <w:szCs w:val="24"/>
-        </w:rPr>
-      </w:pPr>
-      <w:r>
-        <w:rPr>
-          <w:sz w:val="24"/>
-          <w:szCs w:val="24"/>
-        </w:rPr>
-        <w:t>OSI Model</w:t>
-      </w:r>
+        <w:drawing>
+          <wp:inline distT="0" distB="0" distL="0" distR="0" wp14:anchorId="29C0BBDB" wp14:editId="45C5A553">
+            <wp:extent cx="2743200" cy="1733550"/>
+            <wp:effectExtent l="0" t="0" r="0" b="0"/>
+            <wp:docPr id="7" name="Picture 7"/>
+            <wp:cNvGraphicFramePr>
+              <a:graphicFrameLocks xmlns:a="http://schemas.openxmlformats.org/drawingml/2006/main" noChangeAspect="1"/>
+            </wp:cNvGraphicFramePr>
+            <a:graphic xmlns:a="http://schemas.openxmlformats.org/drawingml/2006/main">
+              <a:graphicData uri="http://schemas.openxmlformats.org/drawingml/2006/picture">
+                <pic:pic xmlns:pic="http://schemas.openxmlformats.org/drawingml/2006/picture">
+                  <pic:nvPicPr>
+                    <pic:cNvPr id="1" name=""/>
+                    <pic:cNvPicPr/>
+                  </pic:nvPicPr>
+                  <pic:blipFill>
+                    <a:blip r:embed="rId24"/>
+                    <a:stretch>
+                      <a:fillRect/>
+                    </a:stretch>
+                  </pic:blipFill>
+                  <pic:spPr>
+                    <a:xfrm>
+                      <a:off x="0" y="0"/>
+                      <a:ext cx="2743200" cy="1733550"/>
+                    </a:xfrm>
+                    <a:prstGeom prst="rect">
+                      <a:avLst/>
+                    </a:prstGeom>
+                  </pic:spPr>
+                </pic:pic>
+              </a:graphicData>
+            </a:graphic>
+          </wp:inline>
+        </w:drawing>
+      </w:r>
+    </w:p>
+    <w:p>
+      <w:pPr>
+        <w:rPr>
+          <w:sz w:val="24"/>
+          <w:szCs w:val="24"/>
+        </w:rPr>
+      </w:pPr>
+    </w:p>
+    <w:p>
+      <w:pPr>
+        <w:rPr>
+          <w:sz w:val="24"/>
+          <w:szCs w:val="24"/>
+        </w:rPr>
+      </w:pPr>
+      <w:r>
+        <w:rPr>
+          <w:sz w:val="24"/>
+          <w:szCs w:val="24"/>
+        </w:rPr>
+        <w:t>Application Layer:</w:t>
+      </w:r>
+    </w:p>
+    <w:p>
+      <w:pPr>
+        <w:rPr>
+          <w:sz w:val="24"/>
+          <w:szCs w:val="24"/>
+        </w:rPr>
+      </w:pPr>
+      <w:r>
+        <w:rPr>
+          <w:sz w:val="24"/>
+          <w:szCs w:val="24"/>
+        </w:rPr>
+        <w:t>Provides the interface for applications to access network services, such as email, file transfer, and web browsing.</w:t>
+      </w:r>
+    </w:p>
+    <w:p>
+      <w:pPr>
+        <w:rPr>
+          <w:sz w:val="24"/>
+          <w:szCs w:val="24"/>
+        </w:rPr>
+      </w:pPr>
+    </w:p>
+    <w:p>
+      <w:pPr>
+        <w:rPr>
+          <w:sz w:val="24"/>
+          <w:szCs w:val="24"/>
+        </w:rPr>
+      </w:pPr>
+      <w:r>
+        <w:rPr>
+          <w:sz w:val="24"/>
+          <w:szCs w:val="24"/>
+        </w:rPr>
+        <w:t>Presentation Layer:</w:t>
+      </w:r>
+    </w:p>
+    <w:p>
+      <w:pPr>
+        <w:rPr>
+          <w:sz w:val="24"/>
+          <w:szCs w:val="24"/>
+        </w:rPr>
+      </w:pPr>
+      <w:r>
+        <w:rPr>
+          <w:sz w:val="24"/>
+          <w:szCs w:val="24"/>
+        </w:rPr>
+        <w:t>Handles data formatting, encryption, and compression to ensure compatibility between different systems.</w:t>
+      </w:r>
+    </w:p>
+    <w:p>
+      <w:pPr>
+        <w:rPr>
+          <w:sz w:val="24"/>
+          <w:szCs w:val="24"/>
+        </w:rPr>
+      </w:pPr>
+    </w:p>
+    <w:p>
+      <w:pPr>
+        <w:rPr>
+          <w:sz w:val="24"/>
+          <w:szCs w:val="24"/>
+        </w:rPr>
+      </w:pPr>
+      <w:r>
+        <w:rPr>
+          <w:sz w:val="24"/>
+          <w:szCs w:val="24"/>
+        </w:rPr>
+        <w:t>Session Layer:</w:t>
+      </w:r>
+    </w:p>
+    <w:p>
+      <w:pPr>
+        <w:rPr>
+          <w:sz w:val="24"/>
+          <w:szCs w:val="24"/>
+        </w:rPr>
+      </w:pPr>
+      <w:r>
+        <w:rPr>
+          <w:sz w:val="24"/>
+          <w:szCs w:val="24"/>
+        </w:rPr>
+        <w:t>Manages communication sessions between applications, establishing, coordinating, and terminating connections.</w:t>
+      </w:r>
+    </w:p>
+    <w:p>
+      <w:pPr>
+        <w:rPr>
+          <w:sz w:val="24"/>
+          <w:szCs w:val="24"/>
+        </w:rPr>
+      </w:pPr>
+    </w:p>
+    <w:p>
+      <w:pPr>
+        <w:rPr>
+          <w:sz w:val="24"/>
+          <w:szCs w:val="24"/>
+        </w:rPr>
+      </w:pPr>
+      <w:bookmarkStart w:id="0" w:name="_GoBack"/>
+      <w:bookmarkEnd w:id="0"/>
+    </w:p>
+    <w:p>
+      <w:pPr>
+        <w:rPr>
+          <w:sz w:val="24"/>
+          <w:szCs w:val="24"/>
+        </w:rPr>
+      </w:pPr>
+    </w:p>
+    <w:p>
+      <w:pPr>
+        <w:rPr>
+          <w:sz w:val="24"/>
+          <w:szCs w:val="24"/>
+        </w:rPr>
+      </w:pPr>
+    </w:p>
+    <w:p>
+      <w:pPr>
+        <w:rPr>
+          <w:sz w:val="24"/>
+          <w:szCs w:val="24"/>
+        </w:rPr>
+      </w:pPr>
+    </w:p>
+    <w:p>
+      <w:pPr>
+        <w:rPr>
+          <w:sz w:val="24"/>
+          <w:szCs w:val="24"/>
+        </w:rPr>
+      </w:pPr>
+    </w:p>
+    <w:p>
+      <w:pPr>
+        <w:rPr>
+          <w:sz w:val="24"/>
+          <w:szCs w:val="24"/>
+        </w:rPr>
+      </w:pPr>
+    </w:p>
+    <w:p>
+      <w:pPr>
+        <w:rPr>
+          <w:sz w:val="24"/>
+          <w:szCs w:val="24"/>
+        </w:rPr>
+      </w:pPr>
+    </w:p>
+    <w:p/>
+    <w:p>
+      <w:pPr>
+        <w:rPr>
+          <w:sz w:val="24"/>
+          <w:szCs w:val="24"/>
+        </w:rPr>
+      </w:pPr>
+    </w:p>
+    <w:p>
+      <w:pPr>
+        <w:rPr>
+          <w:sz w:val="24"/>
+          <w:szCs w:val="24"/>
+        </w:rPr>
+      </w:pPr>
+    </w:p>
+    <w:p>
+      <w:pPr>
+        <w:rPr>
+          <w:sz w:val="24"/>
+          <w:szCs w:val="24"/>
+        </w:rPr>
+      </w:pPr>
+    </w:p>
+    <w:p>
+      <w:pPr>
+        <w:rPr>
+          <w:sz w:val="24"/>
+          <w:szCs w:val="24"/>
+        </w:rPr>
+      </w:pPr>
+    </w:p>
+    <w:p>
+      <w:pPr>
+        <w:rPr>
+          <w:sz w:val="24"/>
+          <w:szCs w:val="24"/>
+        </w:rPr>
+      </w:pPr>
     </w:p>
     <w:p>
       <w:pPr>
@@ -3092,7 +5959,7 @@
       </w:pPr>
     </w:p>
     <w:sectPr>
-      <w:headerReference w:type="first" r:id="rId24"/>
+      <w:headerReference w:type="first" r:id="rId25"/>
       <w:pgSz w:w="12240" w:h="15840"/>
       <w:pgMar w:top="1440" w:right="1440" w:bottom="1440" w:left="1440" w:header="720" w:footer="720" w:gutter="0"/>
       <w:cols w:num="2" w:space="720"/>
@@ -3188,9 +6055,9 @@
 <file path=word/numbering.xml><?xml version="1.0" encoding="utf-8"?>
 <w:numbering xmlns:wpc="http://schemas.microsoft.com/office/word/2010/wordprocessingCanvas" xmlns:cx="http://schemas.microsoft.com/office/drawing/2014/chartex" xmlns:cx1="http://schemas.microsoft.com/office/drawing/2015/9/8/chartex" xmlns:mc="http://schemas.openxmlformats.org/markup-compatibility/2006" xmlns:o="urn:schemas-microsoft-com:office:office" xmlns:r="http://schemas.openxmlformats.org/officeDocument/2006/relationships" xmlns:m="http://schemas.openxmlformats.org/officeDocument/2006/math" xmlns:v="urn:schemas-microsoft-com:vml" xmlns:wp14="http://schemas.microsoft.com/office/word/2010/wordprocessingDrawing" xmlns:wp="http://schemas.openxmlformats.org/drawingml/2006/wordprocessingDrawing" xmlns:w10="urn:schemas-microsoft-com:office:word" xmlns:w="http://schemas.openxmlformats.org/wordprocessingml/2006/main" xmlns:w14="http://schemas.microsoft.com/office/word/2010/wordml" xmlns:w15="http://schemas.microsoft.com/office/word/2012/wordml" xmlns:w16se="http://schemas.microsoft.com/office/word/2015/wordml/symex" xmlns:wpg="http://schemas.microsoft.com/office/word/2010/wordprocessingGroup" xmlns:wpi="http://schemas.microsoft.com/office/word/2010/wordprocessingInk" xmlns:wne="http://schemas.microsoft.com/office/word/2006/wordml" xmlns:wps="http://schemas.microsoft.com/office/word/2010/wordprocessingShape" mc:Ignorable="w14 w15 w16se wp14">
   <w:abstractNum w:abstractNumId="0" w15:restartNumberingAfterBreak="0">
-    <w:nsid w:val="0BEB589C"/>
+    <w:nsid w:val="0560514F"/>
     <w:multiLevelType w:val="hybridMultilevel"/>
-    <w:tmpl w:val="565A49E8"/>
+    <w:tmpl w:val="F7DE87A8"/>
     <w:lvl w:ilvl="0" w:tplc="04090001">
       <w:start w:val="1"/>
       <w:numFmt w:val="bullet"/>
@@ -3301,95 +6168,9 @@
     </w:lvl>
   </w:abstractNum>
   <w:abstractNum w:abstractNumId="1" w15:restartNumberingAfterBreak="0">
-    <w:nsid w:val="33C42D3F"/>
+    <w:nsid w:val="0BEB589C"/>
     <w:multiLevelType w:val="hybridMultilevel"/>
-    <w:tmpl w:val="24A08E30"/>
-    <w:lvl w:ilvl="0" w:tplc="04090013">
-      <w:start w:val="1"/>
-      <w:numFmt w:val="upperRoman"/>
-      <w:lvlText w:val="%1."/>
-      <w:lvlJc w:val="right"/>
-      <w:pPr>
-        <w:ind w:left="720" w:hanging="360"/>
-      </w:pPr>
-    </w:lvl>
-    <w:lvl w:ilvl="1" w:tplc="04090019" w:tentative="1">
-      <w:start w:val="1"/>
-      <w:numFmt w:val="lowerLetter"/>
-      <w:lvlText w:val="%2."/>
-      <w:lvlJc w:val="left"/>
-      <w:pPr>
-        <w:ind w:left="1440" w:hanging="360"/>
-      </w:pPr>
-    </w:lvl>
-    <w:lvl w:ilvl="2" w:tplc="0409001B" w:tentative="1">
-      <w:start w:val="1"/>
-      <w:numFmt w:val="lowerRoman"/>
-      <w:lvlText w:val="%3."/>
-      <w:lvlJc w:val="right"/>
-      <w:pPr>
-        <w:ind w:left="2160" w:hanging="180"/>
-      </w:pPr>
-    </w:lvl>
-    <w:lvl w:ilvl="3" w:tplc="0409000F" w:tentative="1">
-      <w:start w:val="1"/>
-      <w:numFmt w:val="decimal"/>
-      <w:lvlText w:val="%4."/>
-      <w:lvlJc w:val="left"/>
-      <w:pPr>
-        <w:ind w:left="2880" w:hanging="360"/>
-      </w:pPr>
-    </w:lvl>
-    <w:lvl w:ilvl="4" w:tplc="04090019" w:tentative="1">
-      <w:start w:val="1"/>
-      <w:numFmt w:val="lowerLetter"/>
-      <w:lvlText w:val="%5."/>
-      <w:lvlJc w:val="left"/>
-      <w:pPr>
-        <w:ind w:left="3600" w:hanging="360"/>
-      </w:pPr>
-    </w:lvl>
-    <w:lvl w:ilvl="5" w:tplc="0409001B" w:tentative="1">
-      <w:start w:val="1"/>
-      <w:numFmt w:val="lowerRoman"/>
-      <w:lvlText w:val="%6."/>
-      <w:lvlJc w:val="right"/>
-      <w:pPr>
-        <w:ind w:left="4320" w:hanging="180"/>
-      </w:pPr>
-    </w:lvl>
-    <w:lvl w:ilvl="6" w:tplc="0409000F" w:tentative="1">
-      <w:start w:val="1"/>
-      <w:numFmt w:val="decimal"/>
-      <w:lvlText w:val="%7."/>
-      <w:lvlJc w:val="left"/>
-      <w:pPr>
-        <w:ind w:left="5040" w:hanging="360"/>
-      </w:pPr>
-    </w:lvl>
-    <w:lvl w:ilvl="7" w:tplc="04090019" w:tentative="1">
-      <w:start w:val="1"/>
-      <w:numFmt w:val="lowerLetter"/>
-      <w:lvlText w:val="%8."/>
-      <w:lvlJc w:val="left"/>
-      <w:pPr>
-        <w:ind w:left="5760" w:hanging="360"/>
-      </w:pPr>
-    </w:lvl>
-    <w:lvl w:ilvl="8" w:tplc="0409001B" w:tentative="1">
-      <w:start w:val="1"/>
-      <w:numFmt w:val="lowerRoman"/>
-      <w:lvlText w:val="%9."/>
-      <w:lvlJc w:val="right"/>
-      <w:pPr>
-        <w:ind w:left="6480" w:hanging="180"/>
-      </w:pPr>
-    </w:lvl>
-  </w:abstractNum>
-  <w:abstractNum w:abstractNumId="2" w15:restartNumberingAfterBreak="0">
-    <w:nsid w:val="38B41DE3"/>
-    <w:multiLevelType w:val="hybridMultilevel"/>
-    <w:tmpl w:val="ADB6BF06"/>
+    <w:tmpl w:val="565A49E8"/>
     <w:lvl w:ilvl="0" w:tplc="04090001">
       <w:start w:val="1"/>
       <w:numFmt w:val="bullet"/>
@@ -3499,10 +6280,10 @@
       </w:rPr>
     </w:lvl>
   </w:abstractNum>
-  <w:abstractNum w:abstractNumId="3" w15:restartNumberingAfterBreak="0">
-    <w:nsid w:val="57790650"/>
+  <w:abstractNum w:abstractNumId="2" w15:restartNumberingAfterBreak="0">
+    <w:nsid w:val="2FF33CF9"/>
     <w:multiLevelType w:val="hybridMultilevel"/>
-    <w:tmpl w:val="CBC02336"/>
+    <w:tmpl w:val="9984D3DA"/>
     <w:lvl w:ilvl="0" w:tplc="04090001">
       <w:start w:val="1"/>
       <w:numFmt w:val="bullet"/>
@@ -3612,16 +6393,450 @@
       </w:rPr>
     </w:lvl>
   </w:abstractNum>
+  <w:abstractNum w:abstractNumId="3" w15:restartNumberingAfterBreak="0">
+    <w:nsid w:val="33C42D3F"/>
+    <w:multiLevelType w:val="hybridMultilevel"/>
+    <w:tmpl w:val="24A08E30"/>
+    <w:lvl w:ilvl="0" w:tplc="04090013">
+      <w:start w:val="1"/>
+      <w:numFmt w:val="upperRoman"/>
+      <w:lvlText w:val="%1."/>
+      <w:lvlJc w:val="right"/>
+      <w:pPr>
+        <w:ind w:left="720" w:hanging="360"/>
+      </w:pPr>
+    </w:lvl>
+    <w:lvl w:ilvl="1" w:tplc="04090019" w:tentative="1">
+      <w:start w:val="1"/>
+      <w:numFmt w:val="lowerLetter"/>
+      <w:lvlText w:val="%2."/>
+      <w:lvlJc w:val="left"/>
+      <w:pPr>
+        <w:ind w:left="1440" w:hanging="360"/>
+      </w:pPr>
+    </w:lvl>
+    <w:lvl w:ilvl="2" w:tplc="0409001B" w:tentative="1">
+      <w:start w:val="1"/>
+      <w:numFmt w:val="lowerRoman"/>
+      <w:lvlText w:val="%3."/>
+      <w:lvlJc w:val="right"/>
+      <w:pPr>
+        <w:ind w:left="2160" w:hanging="180"/>
+      </w:pPr>
+    </w:lvl>
+    <w:lvl w:ilvl="3" w:tplc="0409000F" w:tentative="1">
+      <w:start w:val="1"/>
+      <w:numFmt w:val="decimal"/>
+      <w:lvlText w:val="%4."/>
+      <w:lvlJc w:val="left"/>
+      <w:pPr>
+        <w:ind w:left="2880" w:hanging="360"/>
+      </w:pPr>
+    </w:lvl>
+    <w:lvl w:ilvl="4" w:tplc="04090019" w:tentative="1">
+      <w:start w:val="1"/>
+      <w:numFmt w:val="lowerLetter"/>
+      <w:lvlText w:val="%5."/>
+      <w:lvlJc w:val="left"/>
+      <w:pPr>
+        <w:ind w:left="3600" w:hanging="360"/>
+      </w:pPr>
+    </w:lvl>
+    <w:lvl w:ilvl="5" w:tplc="0409001B" w:tentative="1">
+      <w:start w:val="1"/>
+      <w:numFmt w:val="lowerRoman"/>
+      <w:lvlText w:val="%6."/>
+      <w:lvlJc w:val="right"/>
+      <w:pPr>
+        <w:ind w:left="4320" w:hanging="180"/>
+      </w:pPr>
+    </w:lvl>
+    <w:lvl w:ilvl="6" w:tplc="0409000F" w:tentative="1">
+      <w:start w:val="1"/>
+      <w:numFmt w:val="decimal"/>
+      <w:lvlText w:val="%7."/>
+      <w:lvlJc w:val="left"/>
+      <w:pPr>
+        <w:ind w:left="5040" w:hanging="360"/>
+      </w:pPr>
+    </w:lvl>
+    <w:lvl w:ilvl="7" w:tplc="04090019" w:tentative="1">
+      <w:start w:val="1"/>
+      <w:numFmt w:val="lowerLetter"/>
+      <w:lvlText w:val="%8."/>
+      <w:lvlJc w:val="left"/>
+      <w:pPr>
+        <w:ind w:left="5760" w:hanging="360"/>
+      </w:pPr>
+    </w:lvl>
+    <w:lvl w:ilvl="8" w:tplc="0409001B" w:tentative="1">
+      <w:start w:val="1"/>
+      <w:numFmt w:val="lowerRoman"/>
+      <w:lvlText w:val="%9."/>
+      <w:lvlJc w:val="right"/>
+      <w:pPr>
+        <w:ind w:left="6480" w:hanging="180"/>
+      </w:pPr>
+    </w:lvl>
+  </w:abstractNum>
+  <w:abstractNum w:abstractNumId="4" w15:restartNumberingAfterBreak="0">
+    <w:nsid w:val="38B41DE3"/>
+    <w:multiLevelType w:val="hybridMultilevel"/>
+    <w:tmpl w:val="ADB6BF06"/>
+    <w:lvl w:ilvl="0" w:tplc="04090001">
+      <w:start w:val="1"/>
+      <w:numFmt w:val="bullet"/>
+      <w:lvlText w:val=""/>
+      <w:lvlJc w:val="left"/>
+      <w:pPr>
+        <w:ind w:left="720" w:hanging="360"/>
+      </w:pPr>
+      <w:rPr>
+        <w:rFonts w:ascii="Symbol" w:hAnsi="Symbol" w:hint="default"/>
+      </w:rPr>
+    </w:lvl>
+    <w:lvl w:ilvl="1" w:tplc="04090003" w:tentative="1">
+      <w:start w:val="1"/>
+      <w:numFmt w:val="bullet"/>
+      <w:lvlText w:val="o"/>
+      <w:lvlJc w:val="left"/>
+      <w:pPr>
+        <w:ind w:left="1440" w:hanging="360"/>
+      </w:pPr>
+      <w:rPr>
+        <w:rFonts w:ascii="Courier New" w:hAnsi="Courier New" w:cs="Courier New" w:hint="default"/>
+      </w:rPr>
+    </w:lvl>
+    <w:lvl w:ilvl="2" w:tplc="04090005" w:tentative="1">
+      <w:start w:val="1"/>
+      <w:numFmt w:val="bullet"/>
+      <w:lvlText w:val=""/>
+      <w:lvlJc w:val="left"/>
+      <w:pPr>
+        <w:ind w:left="2160" w:hanging="360"/>
+      </w:pPr>
+      <w:rPr>
+        <w:rFonts w:ascii="Wingdings" w:hAnsi="Wingdings" w:hint="default"/>
+      </w:rPr>
+    </w:lvl>
+    <w:lvl w:ilvl="3" w:tplc="04090001" w:tentative="1">
+      <w:start w:val="1"/>
+      <w:numFmt w:val="bullet"/>
+      <w:lvlText w:val=""/>
+      <w:lvlJc w:val="left"/>
+      <w:pPr>
+        <w:ind w:left="2880" w:hanging="360"/>
+      </w:pPr>
+      <w:rPr>
+        <w:rFonts w:ascii="Symbol" w:hAnsi="Symbol" w:hint="default"/>
+      </w:rPr>
+    </w:lvl>
+    <w:lvl w:ilvl="4" w:tplc="04090003" w:tentative="1">
+      <w:start w:val="1"/>
+      <w:numFmt w:val="bullet"/>
+      <w:lvlText w:val="o"/>
+      <w:lvlJc w:val="left"/>
+      <w:pPr>
+        <w:ind w:left="3600" w:hanging="360"/>
+      </w:pPr>
+      <w:rPr>
+        <w:rFonts w:ascii="Courier New" w:hAnsi="Courier New" w:cs="Courier New" w:hint="default"/>
+      </w:rPr>
+    </w:lvl>
+    <w:lvl w:ilvl="5" w:tplc="04090005" w:tentative="1">
+      <w:start w:val="1"/>
+      <w:numFmt w:val="bullet"/>
+      <w:lvlText w:val=""/>
+      <w:lvlJc w:val="left"/>
+      <w:pPr>
+        <w:ind w:left="4320" w:hanging="360"/>
+      </w:pPr>
+      <w:rPr>
+        <w:rFonts w:ascii="Wingdings" w:hAnsi="Wingdings" w:hint="default"/>
+      </w:rPr>
+    </w:lvl>
+    <w:lvl w:ilvl="6" w:tplc="04090001" w:tentative="1">
+      <w:start w:val="1"/>
+      <w:numFmt w:val="bullet"/>
+      <w:lvlText w:val=""/>
+      <w:lvlJc w:val="left"/>
+      <w:pPr>
+        <w:ind w:left="5040" w:hanging="360"/>
+      </w:pPr>
+      <w:rPr>
+        <w:rFonts w:ascii="Symbol" w:hAnsi="Symbol" w:hint="default"/>
+      </w:rPr>
+    </w:lvl>
+    <w:lvl w:ilvl="7" w:tplc="04090003" w:tentative="1">
+      <w:start w:val="1"/>
+      <w:numFmt w:val="bullet"/>
+      <w:lvlText w:val="o"/>
+      <w:lvlJc w:val="left"/>
+      <w:pPr>
+        <w:ind w:left="5760" w:hanging="360"/>
+      </w:pPr>
+      <w:rPr>
+        <w:rFonts w:ascii="Courier New" w:hAnsi="Courier New" w:cs="Courier New" w:hint="default"/>
+      </w:rPr>
+    </w:lvl>
+    <w:lvl w:ilvl="8" w:tplc="04090005" w:tentative="1">
+      <w:start w:val="1"/>
+      <w:numFmt w:val="bullet"/>
+      <w:lvlText w:val=""/>
+      <w:lvlJc w:val="left"/>
+      <w:pPr>
+        <w:ind w:left="6480" w:hanging="360"/>
+      </w:pPr>
+      <w:rPr>
+        <w:rFonts w:ascii="Wingdings" w:hAnsi="Wingdings" w:hint="default"/>
+      </w:rPr>
+    </w:lvl>
+  </w:abstractNum>
+  <w:abstractNum w:abstractNumId="5" w15:restartNumberingAfterBreak="0">
+    <w:nsid w:val="416F072F"/>
+    <w:multiLevelType w:val="hybridMultilevel"/>
+    <w:tmpl w:val="AF40A296"/>
+    <w:lvl w:ilvl="0" w:tplc="04090001">
+      <w:start w:val="1"/>
+      <w:numFmt w:val="bullet"/>
+      <w:lvlText w:val=""/>
+      <w:lvlJc w:val="left"/>
+      <w:pPr>
+        <w:ind w:left="720" w:hanging="360"/>
+      </w:pPr>
+      <w:rPr>
+        <w:rFonts w:ascii="Symbol" w:hAnsi="Symbol" w:hint="default"/>
+      </w:rPr>
+    </w:lvl>
+    <w:lvl w:ilvl="1" w:tplc="04090003" w:tentative="1">
+      <w:start w:val="1"/>
+      <w:numFmt w:val="bullet"/>
+      <w:lvlText w:val="o"/>
+      <w:lvlJc w:val="left"/>
+      <w:pPr>
+        <w:ind w:left="1440" w:hanging="360"/>
+      </w:pPr>
+      <w:rPr>
+        <w:rFonts w:ascii="Courier New" w:hAnsi="Courier New" w:cs="Courier New" w:hint="default"/>
+      </w:rPr>
+    </w:lvl>
+    <w:lvl w:ilvl="2" w:tplc="04090005" w:tentative="1">
+      <w:start w:val="1"/>
+      <w:numFmt w:val="bullet"/>
+      <w:lvlText w:val=""/>
+      <w:lvlJc w:val="left"/>
+      <w:pPr>
+        <w:ind w:left="2160" w:hanging="360"/>
+      </w:pPr>
+      <w:rPr>
+        <w:rFonts w:ascii="Wingdings" w:hAnsi="Wingdings" w:hint="default"/>
+      </w:rPr>
+    </w:lvl>
+    <w:lvl w:ilvl="3" w:tplc="04090001" w:tentative="1">
+      <w:start w:val="1"/>
+      <w:numFmt w:val="bullet"/>
+      <w:lvlText w:val=""/>
+      <w:lvlJc w:val="left"/>
+      <w:pPr>
+        <w:ind w:left="2880" w:hanging="360"/>
+      </w:pPr>
+      <w:rPr>
+        <w:rFonts w:ascii="Symbol" w:hAnsi="Symbol" w:hint="default"/>
+      </w:rPr>
+    </w:lvl>
+    <w:lvl w:ilvl="4" w:tplc="04090003" w:tentative="1">
+      <w:start w:val="1"/>
+      <w:numFmt w:val="bullet"/>
+      <w:lvlText w:val="o"/>
+      <w:lvlJc w:val="left"/>
+      <w:pPr>
+        <w:ind w:left="3600" w:hanging="360"/>
+      </w:pPr>
+      <w:rPr>
+        <w:rFonts w:ascii="Courier New" w:hAnsi="Courier New" w:cs="Courier New" w:hint="default"/>
+      </w:rPr>
+    </w:lvl>
+    <w:lvl w:ilvl="5" w:tplc="04090005" w:tentative="1">
+      <w:start w:val="1"/>
+      <w:numFmt w:val="bullet"/>
+      <w:lvlText w:val=""/>
+      <w:lvlJc w:val="left"/>
+      <w:pPr>
+        <w:ind w:left="4320" w:hanging="360"/>
+      </w:pPr>
+      <w:rPr>
+        <w:rFonts w:ascii="Wingdings" w:hAnsi="Wingdings" w:hint="default"/>
+      </w:rPr>
+    </w:lvl>
+    <w:lvl w:ilvl="6" w:tplc="04090001" w:tentative="1">
+      <w:start w:val="1"/>
+      <w:numFmt w:val="bullet"/>
+      <w:lvlText w:val=""/>
+      <w:lvlJc w:val="left"/>
+      <w:pPr>
+        <w:ind w:left="5040" w:hanging="360"/>
+      </w:pPr>
+      <w:rPr>
+        <w:rFonts w:ascii="Symbol" w:hAnsi="Symbol" w:hint="default"/>
+      </w:rPr>
+    </w:lvl>
+    <w:lvl w:ilvl="7" w:tplc="04090003" w:tentative="1">
+      <w:start w:val="1"/>
+      <w:numFmt w:val="bullet"/>
+      <w:lvlText w:val="o"/>
+      <w:lvlJc w:val="left"/>
+      <w:pPr>
+        <w:ind w:left="5760" w:hanging="360"/>
+      </w:pPr>
+      <w:rPr>
+        <w:rFonts w:ascii="Courier New" w:hAnsi="Courier New" w:cs="Courier New" w:hint="default"/>
+      </w:rPr>
+    </w:lvl>
+    <w:lvl w:ilvl="8" w:tplc="04090005" w:tentative="1">
+      <w:start w:val="1"/>
+      <w:numFmt w:val="bullet"/>
+      <w:lvlText w:val=""/>
+      <w:lvlJc w:val="left"/>
+      <w:pPr>
+        <w:ind w:left="6480" w:hanging="360"/>
+      </w:pPr>
+      <w:rPr>
+        <w:rFonts w:ascii="Wingdings" w:hAnsi="Wingdings" w:hint="default"/>
+      </w:rPr>
+    </w:lvl>
+  </w:abstractNum>
+  <w:abstractNum w:abstractNumId="6" w15:restartNumberingAfterBreak="0">
+    <w:nsid w:val="57790650"/>
+    <w:multiLevelType w:val="hybridMultilevel"/>
+    <w:tmpl w:val="CBC02336"/>
+    <w:lvl w:ilvl="0" w:tplc="04090001">
+      <w:start w:val="1"/>
+      <w:numFmt w:val="bullet"/>
+      <w:lvlText w:val=""/>
+      <w:lvlJc w:val="left"/>
+      <w:pPr>
+        <w:ind w:left="720" w:hanging="360"/>
+      </w:pPr>
+      <w:rPr>
+        <w:rFonts w:ascii="Symbol" w:hAnsi="Symbol" w:hint="default"/>
+      </w:rPr>
+    </w:lvl>
+    <w:lvl w:ilvl="1" w:tplc="04090003" w:tentative="1">
+      <w:start w:val="1"/>
+      <w:numFmt w:val="bullet"/>
+      <w:lvlText w:val="o"/>
+      <w:lvlJc w:val="left"/>
+      <w:pPr>
+        <w:ind w:left="1440" w:hanging="360"/>
+      </w:pPr>
+      <w:rPr>
+        <w:rFonts w:ascii="Courier New" w:hAnsi="Courier New" w:cs="Courier New" w:hint="default"/>
+      </w:rPr>
+    </w:lvl>
+    <w:lvl w:ilvl="2" w:tplc="04090005" w:tentative="1">
+      <w:start w:val="1"/>
+      <w:numFmt w:val="bullet"/>
+      <w:lvlText w:val=""/>
+      <w:lvlJc w:val="left"/>
+      <w:pPr>
+        <w:ind w:left="2160" w:hanging="360"/>
+      </w:pPr>
+      <w:rPr>
+        <w:rFonts w:ascii="Wingdings" w:hAnsi="Wingdings" w:hint="default"/>
+      </w:rPr>
+    </w:lvl>
+    <w:lvl w:ilvl="3" w:tplc="04090001" w:tentative="1">
+      <w:start w:val="1"/>
+      <w:numFmt w:val="bullet"/>
+      <w:lvlText w:val=""/>
+      <w:lvlJc w:val="left"/>
+      <w:pPr>
+        <w:ind w:left="2880" w:hanging="360"/>
+      </w:pPr>
+      <w:rPr>
+        <w:rFonts w:ascii="Symbol" w:hAnsi="Symbol" w:hint="default"/>
+      </w:rPr>
+    </w:lvl>
+    <w:lvl w:ilvl="4" w:tplc="04090003" w:tentative="1">
+      <w:start w:val="1"/>
+      <w:numFmt w:val="bullet"/>
+      <w:lvlText w:val="o"/>
+      <w:lvlJc w:val="left"/>
+      <w:pPr>
+        <w:ind w:left="3600" w:hanging="360"/>
+      </w:pPr>
+      <w:rPr>
+        <w:rFonts w:ascii="Courier New" w:hAnsi="Courier New" w:cs="Courier New" w:hint="default"/>
+      </w:rPr>
+    </w:lvl>
+    <w:lvl w:ilvl="5" w:tplc="04090005" w:tentative="1">
+      <w:start w:val="1"/>
+      <w:numFmt w:val="bullet"/>
+      <w:lvlText w:val=""/>
+      <w:lvlJc w:val="left"/>
+      <w:pPr>
+        <w:ind w:left="4320" w:hanging="360"/>
+      </w:pPr>
+      <w:rPr>
+        <w:rFonts w:ascii="Wingdings" w:hAnsi="Wingdings" w:hint="default"/>
+      </w:rPr>
+    </w:lvl>
+    <w:lvl w:ilvl="6" w:tplc="04090001" w:tentative="1">
+      <w:start w:val="1"/>
+      <w:numFmt w:val="bullet"/>
+      <w:lvlText w:val=""/>
+      <w:lvlJc w:val="left"/>
+      <w:pPr>
+        <w:ind w:left="5040" w:hanging="360"/>
+      </w:pPr>
+      <w:rPr>
+        <w:rFonts w:ascii="Symbol" w:hAnsi="Symbol" w:hint="default"/>
+      </w:rPr>
+    </w:lvl>
+    <w:lvl w:ilvl="7" w:tplc="04090003" w:tentative="1">
+      <w:start w:val="1"/>
+      <w:numFmt w:val="bullet"/>
+      <w:lvlText w:val="o"/>
+      <w:lvlJc w:val="left"/>
+      <w:pPr>
+        <w:ind w:left="5760" w:hanging="360"/>
+      </w:pPr>
+      <w:rPr>
+        <w:rFonts w:ascii="Courier New" w:hAnsi="Courier New" w:cs="Courier New" w:hint="default"/>
+      </w:rPr>
+    </w:lvl>
+    <w:lvl w:ilvl="8" w:tplc="04090005" w:tentative="1">
+      <w:start w:val="1"/>
+      <w:numFmt w:val="bullet"/>
+      <w:lvlText w:val=""/>
+      <w:lvlJc w:val="left"/>
+      <w:pPr>
+        <w:ind w:left="6480" w:hanging="360"/>
+      </w:pPr>
+      <w:rPr>
+        <w:rFonts w:ascii="Wingdings" w:hAnsi="Wingdings" w:hint="default"/>
+      </w:rPr>
+    </w:lvl>
+  </w:abstractNum>
   <w:num w:numId="1">
+    <w:abstractNumId w:val="6"/>
+  </w:num>
+  <w:num w:numId="2">
+    <w:abstractNumId w:val="1"/>
+  </w:num>
+  <w:num w:numId="3">
     <w:abstractNumId w:val="3"/>
   </w:num>
-  <w:num w:numId="2">
+  <w:num w:numId="4">
+    <w:abstractNumId w:val="4"/>
+  </w:num>
+  <w:num w:numId="5">
+    <w:abstractNumId w:val="5"/>
+  </w:num>
+  <w:num w:numId="6">
     <w:abstractNumId w:val="0"/>
   </w:num>
-  <w:num w:numId="3">
-    <w:abstractNumId w:val="1"/>
-  </w:num>
-  <w:num w:numId="4">
+  <w:num w:numId="7">
     <w:abstractNumId w:val="2"/>
   </w:num>
 </w:numbering>

</xml_diff>